<commit_message>
1.5 tujuan dan amnfaat
</commit_message>
<xml_diff>
--- a/[Sempro] setelah revisi/Penerapan Natural Language Processing (NLP) & Speech-to-text untuk Otomatisasi Entitas pada Inventaris Mobile.docx
+++ b/[Sempro] setelah revisi/Penerapan Natural Language Processing (NLP) & Speech-to-text untuk Otomatisasi Entitas pada Inventaris Mobile.docx
@@ -1120,18 +1120,8 @@
           <w:sz w:val="24"/>
           <w:szCs w:val="24"/>
         </w:rPr>
-        <w:t xml:space="preserve"> </w:t>
-      </w:r>
-      <w:proofErr w:type="gramStart"/>
-      <w:r>
-        <w:rPr>
-          <w:rFonts w:ascii="Times New Roman" w:hAnsi="Times New Roman" w:cs="Times New Roman"/>
-          <w:sz w:val="24"/>
-          <w:szCs w:val="24"/>
-        </w:rPr>
-        <w:t>Oleh :</w:t>
-      </w:r>
-      <w:proofErr w:type="gramEnd"/>
+        <w:t xml:space="preserve"> Oleh :</w:t>
+      </w:r>
     </w:p>
     <w:p>
       <w:pPr>
@@ -1779,7 +1769,6 @@
                 <w:szCs w:val="24"/>
               </w:rPr>
             </w:pPr>
-            <w:proofErr w:type="gramStart"/>
             <w:r>
               <w:rPr>
                 <w:rFonts w:ascii="Times New Roman" w:hAnsi="Times New Roman" w:cs="Times New Roman"/>
@@ -1794,16 +1783,7 @@
                 <w:sz w:val="24"/>
                 <w:szCs w:val="24"/>
               </w:rPr>
-              <w:t>…</w:t>
-            </w:r>
-            <w:proofErr w:type="gramEnd"/>
-            <w:r>
-              <w:rPr>
-                <w:rFonts w:ascii="Times New Roman" w:hAnsi="Times New Roman" w:cs="Times New Roman"/>
-                <w:sz w:val="24"/>
-                <w:szCs w:val="24"/>
-              </w:rPr>
-              <w:t>……………</w:t>
+              <w:t>………………</w:t>
             </w:r>
             <w:r>
               <w:rPr>
@@ -3409,15 +3389,7 @@
                 <w:sz w:val="24"/>
                 <w:szCs w:val="24"/>
               </w:rPr>
-              <w:t xml:space="preserve"> </w:t>
-            </w:r>
-            <w:r>
-              <w:rPr>
-                <w:rFonts w:ascii="Times New Roman" w:hAnsi="Times New Roman" w:cs="Times New Roman"/>
-                <w:sz w:val="24"/>
-                <w:szCs w:val="24"/>
-              </w:rPr>
-              <w:t xml:space="preserve">30 September </w:t>
+              <w:t xml:space="preserve"> 30 September </w:t>
             </w:r>
             <w:r>
               <w:rPr>
@@ -4895,23 +4867,7 @@
                 <w:sz w:val="24"/>
                 <w:szCs w:val="24"/>
               </w:rPr>
-              <w:t xml:space="preserve"> </w:t>
-            </w:r>
-            <w:r>
-              <w:rPr>
-                <w:rFonts w:ascii="Times New Roman" w:hAnsi="Times New Roman" w:cs="Times New Roman"/>
-                <w:sz w:val="24"/>
-                <w:szCs w:val="24"/>
-              </w:rPr>
-              <w:t>30 September</w:t>
-            </w:r>
-            <w:r>
-              <w:rPr>
-                <w:rFonts w:ascii="Times New Roman" w:hAnsi="Times New Roman" w:cs="Times New Roman"/>
-                <w:sz w:val="24"/>
-                <w:szCs w:val="24"/>
-              </w:rPr>
-              <w:t xml:space="preserve"> </w:t>
+              <w:t xml:space="preserve"> 30 September </w:t>
             </w:r>
             <w:r>
               <w:rPr>
@@ -6659,7 +6615,6 @@
                 <w:szCs w:val="24"/>
               </w:rPr>
             </w:pPr>
-            <w:proofErr w:type="gramStart"/>
             <w:r>
               <w:rPr>
                 <w:rFonts w:ascii="Times New Roman" w:hAnsi="Times New Roman" w:cs="Times New Roman"/>
@@ -6674,16 +6629,7 @@
                 <w:sz w:val="24"/>
                 <w:szCs w:val="24"/>
               </w:rPr>
-              <w:t>…</w:t>
-            </w:r>
-            <w:proofErr w:type="gramEnd"/>
-            <w:r>
-              <w:rPr>
-                <w:rFonts w:ascii="Times New Roman" w:hAnsi="Times New Roman" w:cs="Times New Roman"/>
-                <w:sz w:val="24"/>
-                <w:szCs w:val="24"/>
-              </w:rPr>
-              <w:t>…….</w:t>
+              <w:t>……….</w:t>
             </w:r>
             <w:r>
               <w:rPr>
@@ -7743,7 +7689,7 @@
           <w:color w:val="auto"/>
           <w:sz w:val="28"/>
           <w:szCs w:val="28"/>
-          <w:lang w:val="en-US"/>
+          <w:lang w:val="sv-SE"/>
         </w:rPr>
       </w:pPr>
       <w:bookmarkStart w:id="4" w:name="_Toc235475827"/>
@@ -7756,7 +7702,7 @@
           <w:color w:val="auto"/>
           <w:sz w:val="28"/>
           <w:szCs w:val="28"/>
-          <w:lang w:val="en-US"/>
+          <w:lang w:val="sv-SE"/>
         </w:rPr>
         <w:lastRenderedPageBreak/>
         <w:t>KATA PENGANTAR</w:t>
@@ -7767,9 +7713,18 @@
     <w:p>
       <w:pPr>
         <w:spacing w:line="240" w:lineRule="auto"/>
+        <w:rPr>
+          <w:lang w:val="sv-SE"/>
+        </w:rPr>
       </w:pPr>
     </w:p>
-    <w:p/>
+    <w:p>
+      <w:pPr>
+        <w:rPr>
+          <w:lang w:val="sv-SE"/>
+        </w:rPr>
+      </w:pPr>
+    </w:p>
     <w:p>
       <w:pPr>
         <w:ind w:right="19" w:firstLine="450"/>
@@ -7786,239 +7741,33 @@
           <w:rFonts w:ascii="Times New Roman" w:eastAsia="Times New Roman" w:hAnsi="Times New Roman" w:cs="Times New Roman"/>
           <w:color w:val="000000"/>
           <w:sz w:val="24"/>
-        </w:rPr>
-        <w:t xml:space="preserve">Puji </w:t>
-      </w:r>
-      <w:proofErr w:type="spellStart"/>
+          <w:lang w:val="sv-SE"/>
+        </w:rPr>
+        <w:t xml:space="preserve">Puji syukur penulis panjatkan kehadirat Allah SWT, karena atas rahmat dan karunia-Nya, penulis dapat menyelesaikan </w:t>
+      </w:r>
       <w:r>
         <w:rPr>
           <w:rFonts w:ascii="Times New Roman" w:eastAsia="Times New Roman" w:hAnsi="Times New Roman" w:cs="Times New Roman"/>
           <w:color w:val="000000"/>
           <w:sz w:val="24"/>
-        </w:rPr>
-        <w:t>syukur</w:t>
-      </w:r>
-      <w:proofErr w:type="spellEnd"/>
+          <w:lang w:val="sv-SE"/>
+        </w:rPr>
+        <w:t>Skripsi</w:t>
+      </w:r>
       <w:r>
         <w:rPr>
           <w:rFonts w:ascii="Times New Roman" w:eastAsia="Times New Roman" w:hAnsi="Times New Roman" w:cs="Times New Roman"/>
           <w:color w:val="000000"/>
           <w:sz w:val="24"/>
-        </w:rPr>
-        <w:t xml:space="preserve"> </w:t>
-      </w:r>
-      <w:proofErr w:type="spellStart"/>
-      <w:r>
-        <w:rPr>
-          <w:rFonts w:ascii="Times New Roman" w:eastAsia="Times New Roman" w:hAnsi="Times New Roman" w:cs="Times New Roman"/>
-          <w:color w:val="000000"/>
-          <w:sz w:val="24"/>
-        </w:rPr>
-        <w:t>penulis</w:t>
-      </w:r>
-      <w:proofErr w:type="spellEnd"/>
-      <w:r>
-        <w:rPr>
-          <w:rFonts w:ascii="Times New Roman" w:eastAsia="Times New Roman" w:hAnsi="Times New Roman" w:cs="Times New Roman"/>
-          <w:color w:val="000000"/>
-          <w:sz w:val="24"/>
-        </w:rPr>
-        <w:t xml:space="preserve"> </w:t>
-      </w:r>
-      <w:proofErr w:type="spellStart"/>
-      <w:r>
-        <w:rPr>
-          <w:rFonts w:ascii="Times New Roman" w:eastAsia="Times New Roman" w:hAnsi="Times New Roman" w:cs="Times New Roman"/>
-          <w:color w:val="000000"/>
-          <w:sz w:val="24"/>
-        </w:rPr>
-        <w:t>panjatkan</w:t>
-      </w:r>
-      <w:proofErr w:type="spellEnd"/>
-      <w:r>
-        <w:rPr>
-          <w:rFonts w:ascii="Times New Roman" w:eastAsia="Times New Roman" w:hAnsi="Times New Roman" w:cs="Times New Roman"/>
-          <w:color w:val="000000"/>
-          <w:sz w:val="24"/>
-        </w:rPr>
-        <w:t xml:space="preserve"> </w:t>
-      </w:r>
-      <w:proofErr w:type="spellStart"/>
-      <w:r>
-        <w:rPr>
-          <w:rFonts w:ascii="Times New Roman" w:eastAsia="Times New Roman" w:hAnsi="Times New Roman" w:cs="Times New Roman"/>
-          <w:color w:val="000000"/>
-          <w:sz w:val="24"/>
-        </w:rPr>
-        <w:t>kehadirat</w:t>
-      </w:r>
-      <w:proofErr w:type="spellEnd"/>
-      <w:r>
-        <w:rPr>
-          <w:rFonts w:ascii="Times New Roman" w:eastAsia="Times New Roman" w:hAnsi="Times New Roman" w:cs="Times New Roman"/>
-          <w:color w:val="000000"/>
-          <w:sz w:val="24"/>
-        </w:rPr>
-        <w:t xml:space="preserve"> Allah SWT, </w:t>
-      </w:r>
-      <w:proofErr w:type="spellStart"/>
-      <w:r>
-        <w:rPr>
-          <w:rFonts w:ascii="Times New Roman" w:eastAsia="Times New Roman" w:hAnsi="Times New Roman" w:cs="Times New Roman"/>
-          <w:color w:val="000000"/>
-          <w:sz w:val="24"/>
-        </w:rPr>
-        <w:t>karena</w:t>
-      </w:r>
-      <w:proofErr w:type="spellEnd"/>
-      <w:r>
-        <w:rPr>
-          <w:rFonts w:ascii="Times New Roman" w:eastAsia="Times New Roman" w:hAnsi="Times New Roman" w:cs="Times New Roman"/>
-          <w:color w:val="000000"/>
-          <w:sz w:val="24"/>
-        </w:rPr>
-        <w:t xml:space="preserve"> </w:t>
-      </w:r>
-      <w:proofErr w:type="spellStart"/>
-      <w:r>
-        <w:rPr>
-          <w:rFonts w:ascii="Times New Roman" w:eastAsia="Times New Roman" w:hAnsi="Times New Roman" w:cs="Times New Roman"/>
-          <w:color w:val="000000"/>
-          <w:sz w:val="24"/>
-        </w:rPr>
-        <w:t>atas</w:t>
-      </w:r>
-      <w:proofErr w:type="spellEnd"/>
-      <w:r>
-        <w:rPr>
-          <w:rFonts w:ascii="Times New Roman" w:eastAsia="Times New Roman" w:hAnsi="Times New Roman" w:cs="Times New Roman"/>
-          <w:color w:val="000000"/>
-          <w:sz w:val="24"/>
-        </w:rPr>
-        <w:t xml:space="preserve"> </w:t>
-      </w:r>
-      <w:proofErr w:type="spellStart"/>
-      <w:r>
-        <w:rPr>
-          <w:rFonts w:ascii="Times New Roman" w:eastAsia="Times New Roman" w:hAnsi="Times New Roman" w:cs="Times New Roman"/>
-          <w:color w:val="000000"/>
-          <w:sz w:val="24"/>
-        </w:rPr>
-        <w:t>rahmat</w:t>
-      </w:r>
-      <w:proofErr w:type="spellEnd"/>
-      <w:r>
-        <w:rPr>
-          <w:rFonts w:ascii="Times New Roman" w:eastAsia="Times New Roman" w:hAnsi="Times New Roman" w:cs="Times New Roman"/>
-          <w:color w:val="000000"/>
-          <w:sz w:val="24"/>
-        </w:rPr>
-        <w:t xml:space="preserve"> dan </w:t>
-      </w:r>
-      <w:proofErr w:type="spellStart"/>
-      <w:r>
-        <w:rPr>
-          <w:rFonts w:ascii="Times New Roman" w:eastAsia="Times New Roman" w:hAnsi="Times New Roman" w:cs="Times New Roman"/>
-          <w:color w:val="000000"/>
-          <w:sz w:val="24"/>
-        </w:rPr>
-        <w:t>karunia</w:t>
-      </w:r>
-      <w:proofErr w:type="spellEnd"/>
-      <w:r>
-        <w:rPr>
-          <w:rFonts w:ascii="Times New Roman" w:eastAsia="Times New Roman" w:hAnsi="Times New Roman" w:cs="Times New Roman"/>
-          <w:color w:val="000000"/>
-          <w:sz w:val="24"/>
-        </w:rPr>
-        <w:t xml:space="preserve">-Nya, </w:t>
-      </w:r>
-      <w:proofErr w:type="spellStart"/>
-      <w:r>
-        <w:rPr>
-          <w:rFonts w:ascii="Times New Roman" w:eastAsia="Times New Roman" w:hAnsi="Times New Roman" w:cs="Times New Roman"/>
-          <w:color w:val="000000"/>
-          <w:sz w:val="24"/>
-        </w:rPr>
-        <w:t>penulis</w:t>
-      </w:r>
-      <w:proofErr w:type="spellEnd"/>
-      <w:r>
-        <w:rPr>
-          <w:rFonts w:ascii="Times New Roman" w:eastAsia="Times New Roman" w:hAnsi="Times New Roman" w:cs="Times New Roman"/>
-          <w:color w:val="000000"/>
-          <w:sz w:val="24"/>
-        </w:rPr>
-        <w:t xml:space="preserve"> </w:t>
-      </w:r>
-      <w:proofErr w:type="spellStart"/>
-      <w:r>
-        <w:rPr>
-          <w:rFonts w:ascii="Times New Roman" w:eastAsia="Times New Roman" w:hAnsi="Times New Roman" w:cs="Times New Roman"/>
-          <w:color w:val="000000"/>
-          <w:sz w:val="24"/>
-        </w:rPr>
-        <w:t>dapat</w:t>
-      </w:r>
-      <w:proofErr w:type="spellEnd"/>
-      <w:r>
-        <w:rPr>
-          <w:rFonts w:ascii="Times New Roman" w:eastAsia="Times New Roman" w:hAnsi="Times New Roman" w:cs="Times New Roman"/>
-          <w:color w:val="000000"/>
-          <w:sz w:val="24"/>
-        </w:rPr>
-        <w:t xml:space="preserve"> </w:t>
-      </w:r>
-      <w:proofErr w:type="spellStart"/>
-      <w:r>
-        <w:rPr>
-          <w:rFonts w:ascii="Times New Roman" w:eastAsia="Times New Roman" w:hAnsi="Times New Roman" w:cs="Times New Roman"/>
-          <w:color w:val="000000"/>
-          <w:sz w:val="24"/>
-        </w:rPr>
-        <w:t>menyelesaikan</w:t>
-      </w:r>
-      <w:proofErr w:type="spellEnd"/>
-      <w:r>
-        <w:rPr>
-          <w:rFonts w:ascii="Times New Roman" w:eastAsia="Times New Roman" w:hAnsi="Times New Roman" w:cs="Times New Roman"/>
-          <w:color w:val="000000"/>
-          <w:sz w:val="24"/>
-        </w:rPr>
-        <w:t xml:space="preserve"> </w:t>
-      </w:r>
-      <w:proofErr w:type="spellStart"/>
-      <w:r>
-        <w:rPr>
-          <w:rFonts w:ascii="Times New Roman" w:eastAsia="Times New Roman" w:hAnsi="Times New Roman" w:cs="Times New Roman"/>
-          <w:color w:val="000000"/>
-          <w:sz w:val="24"/>
-        </w:rPr>
-        <w:t>Skripsi</w:t>
-      </w:r>
-      <w:proofErr w:type="spellEnd"/>
-      <w:r>
-        <w:rPr>
-          <w:rFonts w:ascii="Times New Roman" w:eastAsia="Times New Roman" w:hAnsi="Times New Roman" w:cs="Times New Roman"/>
-          <w:color w:val="000000"/>
-          <w:sz w:val="24"/>
-        </w:rPr>
-        <w:t xml:space="preserve"> yang </w:t>
-      </w:r>
-      <w:proofErr w:type="spellStart"/>
-      <w:r>
-        <w:rPr>
-          <w:rFonts w:ascii="Times New Roman" w:eastAsia="Times New Roman" w:hAnsi="Times New Roman" w:cs="Times New Roman"/>
-          <w:color w:val="000000"/>
-          <w:sz w:val="24"/>
-        </w:rPr>
-        <w:t>berjudul</w:t>
-      </w:r>
-      <w:proofErr w:type="spellEnd"/>
+          <w:lang w:val="sv-SE"/>
+        </w:rPr>
+        <w:t xml:space="preserve"> yang berjudul</w:t>
+      </w:r>
       <w:r>
         <w:rPr>
           <w:rFonts w:ascii="Calibri" w:eastAsia="Calibri" w:hAnsi="Calibri" w:cs="Calibri"/>
           <w:color w:val="000000"/>
+          <w:lang w:val="sv-SE"/>
         </w:rPr>
         <w:t xml:space="preserve"> </w:t>
       </w:r>
@@ -8028,6 +7777,7 @@
           <w:b/>
           <w:color w:val="000000"/>
           <w:sz w:val="24"/>
+          <w:lang w:val="sv-SE"/>
         </w:rPr>
         <w:t>“</w:t>
       </w:r>
@@ -8037,6 +7787,7 @@
           <w:b/>
           <w:color w:val="000000"/>
           <w:sz w:val="24"/>
+          <w:lang w:val="sv-SE"/>
         </w:rPr>
         <w:t xml:space="preserve">PENERAPAN </w:t>
       </w:r>
@@ -8048,6 +7799,7 @@
           <w:iCs/>
           <w:color w:val="000000"/>
           <w:sz w:val="24"/>
+          <w:lang w:val="sv-SE"/>
         </w:rPr>
         <w:t>NATURAL</w:t>
       </w:r>
@@ -8057,6 +7809,7 @@
           <w:b/>
           <w:color w:val="000000"/>
           <w:sz w:val="24"/>
+          <w:lang w:val="sv-SE"/>
         </w:rPr>
         <w:t xml:space="preserve"> </w:t>
       </w:r>
@@ -8068,6 +7821,7 @@
           <w:iCs/>
           <w:color w:val="000000"/>
           <w:sz w:val="24"/>
+          <w:lang w:val="sv-SE"/>
         </w:rPr>
         <w:t>LANGUAGE PROCESSING (NLP)</w:t>
       </w:r>
@@ -8077,6 +7831,7 @@
           <w:b/>
           <w:color w:val="000000"/>
           <w:sz w:val="24"/>
+          <w:lang w:val="sv-SE"/>
         </w:rPr>
         <w:t xml:space="preserve"> &amp; </w:t>
       </w:r>
@@ -8088,6 +7843,7 @@
           <w:iCs/>
           <w:color w:val="000000"/>
           <w:sz w:val="24"/>
+          <w:lang w:val="sv-SE"/>
         </w:rPr>
         <w:t>SPEECH-TO-TEXT</w:t>
       </w:r>
@@ -8097,6 +7853,7 @@
           <w:b/>
           <w:color w:val="000000"/>
           <w:sz w:val="24"/>
+          <w:lang w:val="sv-SE"/>
         </w:rPr>
         <w:t xml:space="preserve"> UNTUK OTOMATISASI ENTITAS PADA INVENTARIS </w:t>
       </w:r>
@@ -8108,6 +7865,7 @@
           <w:iCs/>
           <w:color w:val="000000"/>
           <w:sz w:val="24"/>
+          <w:lang w:val="sv-SE"/>
         </w:rPr>
         <w:t>MOBILE</w:t>
       </w:r>
@@ -8117,6 +7875,7 @@
           <w:b/>
           <w:color w:val="000000"/>
           <w:sz w:val="24"/>
+          <w:lang w:val="sv-SE"/>
         </w:rPr>
         <w:t>"</w:t>
       </w:r>
@@ -8125,6 +7884,7 @@
           <w:rFonts w:ascii="Times New Roman" w:eastAsia="Times New Roman" w:hAnsi="Times New Roman" w:cs="Times New Roman"/>
           <w:color w:val="000000"/>
           <w:sz w:val="24"/>
+          <w:lang w:val="sv-SE"/>
         </w:rPr>
         <w:t xml:space="preserve">. </w:t>
       </w:r>
@@ -14553,7 +14313,16 @@
           <w:szCs w:val="24"/>
           <w:lang w:val="sv-SE"/>
         </w:rPr>
-        <w:t xml:space="preserve"> yang difokuskan untuk membantu individu dalam mencatat, mencari, dan mengelola barang pribadi, khususnya bagi pengguna yang sering lupa lokasi barang.</w:t>
+        <w:t xml:space="preserve"> yang difokuskan untuk membantu individu dalam mencatat, mencari, dan mengelola barang pribadi, khususnya melalui otomatisasi ekstraksi entitas dari ucapan pengguna</w:t>
+      </w:r>
+      <w:r>
+        <w:rPr>
+          <w:rFonts w:ascii="Times New Roman" w:hAnsi="Times New Roman" w:cs="Times New Roman"/>
+          <w:sz w:val="24"/>
+          <w:szCs w:val="24"/>
+          <w:lang w:val="sv-SE"/>
+        </w:rPr>
+        <w:t>.</w:t>
       </w:r>
     </w:p>
     <w:p>
@@ -14599,7 +14368,6 @@
           <w:rFonts w:ascii="Times New Roman" w:hAnsi="Times New Roman" w:cs="Times New Roman"/>
           <w:sz w:val="24"/>
           <w:szCs w:val="24"/>
-          <w:lang w:val="sv-SE"/>
         </w:rPr>
         <w:t xml:space="preserve"> </w:t>
       </w:r>
@@ -14611,8 +14379,18 @@
           <w:sz w:val="24"/>
           <w:szCs w:val="24"/>
         </w:rPr>
-        <w:t>Speech-to-Text</w:t>
-      </w:r>
+        <w:t xml:space="preserve">Speech-to-Text </w:t>
+      </w:r>
+      <w:proofErr w:type="spellStart"/>
+      <w:r>
+        <w:rPr>
+          <w:rFonts w:ascii="Times New Roman" w:hAnsi="Times New Roman" w:cs="Times New Roman"/>
+          <w:sz w:val="24"/>
+          <w:szCs w:val="24"/>
+        </w:rPr>
+        <w:t>untuk</w:t>
+      </w:r>
+      <w:proofErr w:type="spellEnd"/>
       <w:r>
         <w:rPr>
           <w:rFonts w:ascii="Times New Roman" w:hAnsi="Times New Roman" w:cs="Times New Roman"/>
@@ -14628,7 +14406,7 @@
           <w:sz w:val="24"/>
           <w:szCs w:val="24"/>
         </w:rPr>
-        <w:t>untuk</w:t>
+        <w:t>mengubah</w:t>
       </w:r>
       <w:proofErr w:type="spellEnd"/>
       <w:r>
@@ -14646,7 +14424,7 @@
           <w:sz w:val="24"/>
           <w:szCs w:val="24"/>
         </w:rPr>
-        <w:t>memudahkan</w:t>
+        <w:t>ucapan</w:t>
       </w:r>
       <w:proofErr w:type="spellEnd"/>
       <w:r>
@@ -14655,7 +14433,7 @@
           <w:sz w:val="24"/>
           <w:szCs w:val="24"/>
         </w:rPr>
-        <w:t xml:space="preserve"> proses input data </w:t>
+        <w:t xml:space="preserve"> </w:t>
       </w:r>
       <w:proofErr w:type="spellStart"/>
       <w:r>
@@ -14664,7 +14442,43 @@
           <w:sz w:val="24"/>
           <w:szCs w:val="24"/>
         </w:rPr>
-        <w:t>barang</w:t>
+        <w:t>pengguna</w:t>
+      </w:r>
+      <w:proofErr w:type="spellEnd"/>
+      <w:r>
+        <w:rPr>
+          <w:rFonts w:ascii="Times New Roman" w:hAnsi="Times New Roman" w:cs="Times New Roman"/>
+          <w:sz w:val="24"/>
+          <w:szCs w:val="24"/>
+        </w:rPr>
+        <w:t xml:space="preserve"> </w:t>
+      </w:r>
+      <w:proofErr w:type="spellStart"/>
+      <w:r>
+        <w:rPr>
+          <w:rFonts w:ascii="Times New Roman" w:hAnsi="Times New Roman" w:cs="Times New Roman"/>
+          <w:sz w:val="24"/>
+          <w:szCs w:val="24"/>
+        </w:rPr>
+        <w:t>menjadi</w:t>
+      </w:r>
+      <w:proofErr w:type="spellEnd"/>
+      <w:r>
+        <w:rPr>
+          <w:rFonts w:ascii="Times New Roman" w:hAnsi="Times New Roman" w:cs="Times New Roman"/>
+          <w:sz w:val="24"/>
+          <w:szCs w:val="24"/>
+        </w:rPr>
+        <w:t xml:space="preserve"> </w:t>
+      </w:r>
+      <w:proofErr w:type="spellStart"/>
+      <w:r>
+        <w:rPr>
+          <w:rFonts w:ascii="Times New Roman" w:hAnsi="Times New Roman" w:cs="Times New Roman"/>
+          <w:sz w:val="24"/>
+          <w:szCs w:val="24"/>
+        </w:rPr>
+        <w:t>teks</w:t>
       </w:r>
       <w:proofErr w:type="spellEnd"/>
       <w:r>
@@ -14695,6 +14509,7 @@
           <w:sz w:val="24"/>
           <w:szCs w:val="24"/>
         </w:rPr>
+        <w:lastRenderedPageBreak/>
         <w:t xml:space="preserve"> </w:t>
       </w:r>
       <w:r>
@@ -14705,8 +14520,18 @@
           <w:sz w:val="24"/>
           <w:szCs w:val="24"/>
         </w:rPr>
-        <w:t>QR Code</w:t>
-      </w:r>
+        <w:t xml:space="preserve">Natural Language Processing (NLP), </w:t>
+      </w:r>
+      <w:proofErr w:type="spellStart"/>
+      <w:r>
+        <w:rPr>
+          <w:rFonts w:ascii="Times New Roman" w:hAnsi="Times New Roman" w:cs="Times New Roman"/>
+          <w:sz w:val="24"/>
+          <w:szCs w:val="24"/>
+        </w:rPr>
+        <w:t>khususnya</w:t>
+      </w:r>
+      <w:proofErr w:type="spellEnd"/>
       <w:r>
         <w:rPr>
           <w:rFonts w:ascii="Times New Roman" w:hAnsi="Times New Roman" w:cs="Times New Roman"/>
@@ -14722,6 +14547,70 @@
           <w:sz w:val="24"/>
           <w:szCs w:val="24"/>
         </w:rPr>
+        <w:t>teknik</w:t>
+      </w:r>
+      <w:proofErr w:type="spellEnd"/>
+      <w:r>
+        <w:rPr>
+          <w:rFonts w:ascii="Times New Roman" w:hAnsi="Times New Roman" w:cs="Times New Roman"/>
+          <w:sz w:val="24"/>
+          <w:szCs w:val="24"/>
+        </w:rPr>
+        <w:t xml:space="preserve"> </w:t>
+      </w:r>
+      <w:proofErr w:type="spellStart"/>
+      <w:r>
+        <w:rPr>
+          <w:rFonts w:ascii="Times New Roman" w:hAnsi="Times New Roman" w:cs="Times New Roman"/>
+          <w:sz w:val="24"/>
+          <w:szCs w:val="24"/>
+        </w:rPr>
+        <w:t>ekstraksi</w:t>
+      </w:r>
+      <w:proofErr w:type="spellEnd"/>
+      <w:r>
+        <w:rPr>
+          <w:rFonts w:ascii="Times New Roman" w:hAnsi="Times New Roman" w:cs="Times New Roman"/>
+          <w:sz w:val="24"/>
+          <w:szCs w:val="24"/>
+        </w:rPr>
+        <w:t xml:space="preserve"> </w:t>
+      </w:r>
+      <w:proofErr w:type="spellStart"/>
+      <w:r>
+        <w:rPr>
+          <w:rFonts w:ascii="Times New Roman" w:hAnsi="Times New Roman" w:cs="Times New Roman"/>
+          <w:sz w:val="24"/>
+          <w:szCs w:val="24"/>
+        </w:rPr>
+        <w:t>entitas</w:t>
+      </w:r>
+      <w:proofErr w:type="spellEnd"/>
+      <w:r>
+        <w:rPr>
+          <w:rFonts w:ascii="Times New Roman" w:hAnsi="Times New Roman" w:cs="Times New Roman"/>
+          <w:i/>
+          <w:iCs/>
+          <w:sz w:val="24"/>
+          <w:szCs w:val="24"/>
+        </w:rPr>
+        <w:t xml:space="preserve"> (Named Entity Recognition</w:t>
+      </w:r>
+      <w:r>
+        <w:rPr>
+          <w:rFonts w:ascii="Times New Roman" w:hAnsi="Times New Roman" w:cs="Times New Roman"/>
+          <w:sz w:val="24"/>
+          <w:szCs w:val="24"/>
+        </w:rPr>
+        <w:t xml:space="preserve">), </w:t>
+      </w:r>
+      <w:proofErr w:type="spellStart"/>
+      <w:r>
+        <w:rPr>
+          <w:rFonts w:ascii="Times New Roman" w:hAnsi="Times New Roman" w:cs="Times New Roman"/>
+          <w:sz w:val="24"/>
+          <w:szCs w:val="24"/>
+        </w:rPr>
         <w:t>untuk</w:t>
       </w:r>
       <w:proofErr w:type="spellEnd"/>
@@ -14731,7 +14620,7 @@
           <w:sz w:val="24"/>
           <w:szCs w:val="24"/>
         </w:rPr>
-        <w:t xml:space="preserve"> proses </w:t>
+        <w:t xml:space="preserve"> </w:t>
       </w:r>
       <w:proofErr w:type="spellStart"/>
       <w:r>
@@ -14740,7 +14629,7 @@
           <w:sz w:val="24"/>
           <w:szCs w:val="24"/>
         </w:rPr>
-        <w:t>identifikasi</w:t>
+        <w:t>mengenali</w:t>
       </w:r>
       <w:proofErr w:type="spellEnd"/>
       <w:r>
@@ -14749,6 +14638,24 @@
           <w:sz w:val="24"/>
           <w:szCs w:val="24"/>
         </w:rPr>
+        <w:t xml:space="preserve"> dan </w:t>
+      </w:r>
+      <w:proofErr w:type="spellStart"/>
+      <w:r>
+        <w:rPr>
+          <w:rFonts w:ascii="Times New Roman" w:hAnsi="Times New Roman" w:cs="Times New Roman"/>
+          <w:sz w:val="24"/>
+          <w:szCs w:val="24"/>
+        </w:rPr>
+        <w:t>memisahkan</w:t>
+      </w:r>
+      <w:proofErr w:type="spellEnd"/>
+      <w:r>
+        <w:rPr>
+          <w:rFonts w:ascii="Times New Roman" w:hAnsi="Times New Roman" w:cs="Times New Roman"/>
+          <w:sz w:val="24"/>
+          <w:szCs w:val="24"/>
+        </w:rPr>
         <w:t xml:space="preserve"> </w:t>
       </w:r>
       <w:proofErr w:type="spellStart"/>
@@ -14758,9 +14665,307 @@
           <w:sz w:val="24"/>
           <w:szCs w:val="24"/>
         </w:rPr>
+        <w:t>informasi</w:t>
+      </w:r>
+      <w:proofErr w:type="spellEnd"/>
+      <w:r>
+        <w:rPr>
+          <w:rFonts w:ascii="Times New Roman" w:hAnsi="Times New Roman" w:cs="Times New Roman"/>
+          <w:sz w:val="24"/>
+          <w:szCs w:val="24"/>
+        </w:rPr>
+        <w:t xml:space="preserve"> </w:t>
+      </w:r>
+      <w:proofErr w:type="spellStart"/>
+      <w:r>
+        <w:rPr>
+          <w:rFonts w:ascii="Times New Roman" w:hAnsi="Times New Roman" w:cs="Times New Roman"/>
+          <w:sz w:val="24"/>
+          <w:szCs w:val="24"/>
+        </w:rPr>
+        <w:t>penting</w:t>
+      </w:r>
+      <w:proofErr w:type="spellEnd"/>
+      <w:r>
+        <w:rPr>
+          <w:rFonts w:ascii="Times New Roman" w:hAnsi="Times New Roman" w:cs="Times New Roman"/>
+          <w:sz w:val="24"/>
+          <w:szCs w:val="24"/>
+        </w:rPr>
+        <w:t xml:space="preserve"> (</w:t>
+      </w:r>
+      <w:proofErr w:type="spellStart"/>
+      <w:r>
+        <w:rPr>
+          <w:rFonts w:ascii="Times New Roman" w:hAnsi="Times New Roman" w:cs="Times New Roman"/>
+          <w:sz w:val="24"/>
+          <w:szCs w:val="24"/>
+        </w:rPr>
+        <w:t>nama</w:t>
+      </w:r>
+      <w:proofErr w:type="spellEnd"/>
+      <w:r>
+        <w:rPr>
+          <w:rFonts w:ascii="Times New Roman" w:hAnsi="Times New Roman" w:cs="Times New Roman"/>
+          <w:sz w:val="24"/>
+          <w:szCs w:val="24"/>
+        </w:rPr>
+        <w:t xml:space="preserve"> </w:t>
+      </w:r>
+      <w:proofErr w:type="spellStart"/>
+      <w:r>
+        <w:rPr>
+          <w:rFonts w:ascii="Times New Roman" w:hAnsi="Times New Roman" w:cs="Times New Roman"/>
+          <w:sz w:val="24"/>
+          <w:szCs w:val="24"/>
+        </w:rPr>
         <w:t>barang</w:t>
       </w:r>
       <w:proofErr w:type="spellEnd"/>
+      <w:r>
+        <w:rPr>
+          <w:rFonts w:ascii="Times New Roman" w:hAnsi="Times New Roman" w:cs="Times New Roman"/>
+          <w:sz w:val="24"/>
+          <w:szCs w:val="24"/>
+        </w:rPr>
+        <w:t xml:space="preserve">, </w:t>
+      </w:r>
+      <w:proofErr w:type="spellStart"/>
+      <w:r>
+        <w:rPr>
+          <w:rFonts w:ascii="Times New Roman" w:hAnsi="Times New Roman" w:cs="Times New Roman"/>
+          <w:sz w:val="24"/>
+          <w:szCs w:val="24"/>
+        </w:rPr>
+        <w:t>lokasi</w:t>
+      </w:r>
+      <w:proofErr w:type="spellEnd"/>
+      <w:r>
+        <w:rPr>
+          <w:rFonts w:ascii="Times New Roman" w:hAnsi="Times New Roman" w:cs="Times New Roman"/>
+          <w:sz w:val="24"/>
+          <w:szCs w:val="24"/>
+        </w:rPr>
+        <w:t xml:space="preserve"> </w:t>
+      </w:r>
+      <w:proofErr w:type="spellStart"/>
+      <w:r>
+        <w:rPr>
+          <w:rFonts w:ascii="Times New Roman" w:hAnsi="Times New Roman" w:cs="Times New Roman"/>
+          <w:sz w:val="24"/>
+          <w:szCs w:val="24"/>
+        </w:rPr>
+        <w:t>penyimpanan</w:t>
+      </w:r>
+      <w:proofErr w:type="spellEnd"/>
+      <w:r>
+        <w:rPr>
+          <w:rFonts w:ascii="Times New Roman" w:hAnsi="Times New Roman" w:cs="Times New Roman"/>
+          <w:sz w:val="24"/>
+          <w:szCs w:val="24"/>
+        </w:rPr>
+        <w:t xml:space="preserve">, </w:t>
+      </w:r>
+      <w:proofErr w:type="spellStart"/>
+      <w:r>
+        <w:rPr>
+          <w:rFonts w:ascii="Times New Roman" w:hAnsi="Times New Roman" w:cs="Times New Roman"/>
+          <w:sz w:val="24"/>
+          <w:szCs w:val="24"/>
+        </w:rPr>
+        <w:t>jumlah</w:t>
+      </w:r>
+      <w:proofErr w:type="spellEnd"/>
+      <w:r>
+        <w:rPr>
+          <w:rFonts w:ascii="Times New Roman" w:hAnsi="Times New Roman" w:cs="Times New Roman"/>
+          <w:sz w:val="24"/>
+          <w:szCs w:val="24"/>
+        </w:rPr>
+        <w:t xml:space="preserve">, dan </w:t>
+      </w:r>
+      <w:proofErr w:type="spellStart"/>
+      <w:r>
+        <w:rPr>
+          <w:rFonts w:ascii="Times New Roman" w:hAnsi="Times New Roman" w:cs="Times New Roman"/>
+          <w:sz w:val="24"/>
+          <w:szCs w:val="24"/>
+        </w:rPr>
+        <w:t>tanggal</w:t>
+      </w:r>
+      <w:proofErr w:type="spellEnd"/>
+      <w:r>
+        <w:rPr>
+          <w:rFonts w:ascii="Times New Roman" w:hAnsi="Times New Roman" w:cs="Times New Roman"/>
+          <w:sz w:val="24"/>
+          <w:szCs w:val="24"/>
+        </w:rPr>
+        <w:t xml:space="preserve"> </w:t>
+      </w:r>
+      <w:proofErr w:type="spellStart"/>
+      <w:r>
+        <w:rPr>
+          <w:rFonts w:ascii="Times New Roman" w:hAnsi="Times New Roman" w:cs="Times New Roman"/>
+          <w:sz w:val="24"/>
+          <w:szCs w:val="24"/>
+        </w:rPr>
+        <w:t>garansi</w:t>
+      </w:r>
+      <w:proofErr w:type="spellEnd"/>
+      <w:r>
+        <w:rPr>
+          <w:rFonts w:ascii="Times New Roman" w:hAnsi="Times New Roman" w:cs="Times New Roman"/>
+          <w:sz w:val="24"/>
+          <w:szCs w:val="24"/>
+        </w:rPr>
+        <w:t xml:space="preserve">) </w:t>
+      </w:r>
+      <w:proofErr w:type="spellStart"/>
+      <w:r>
+        <w:rPr>
+          <w:rFonts w:ascii="Times New Roman" w:hAnsi="Times New Roman" w:cs="Times New Roman"/>
+          <w:sz w:val="24"/>
+          <w:szCs w:val="24"/>
+        </w:rPr>
+        <w:t>dari</w:t>
+      </w:r>
+      <w:proofErr w:type="spellEnd"/>
+      <w:r>
+        <w:rPr>
+          <w:rFonts w:ascii="Times New Roman" w:hAnsi="Times New Roman" w:cs="Times New Roman"/>
+          <w:sz w:val="24"/>
+          <w:szCs w:val="24"/>
+        </w:rPr>
+        <w:t xml:space="preserve"> </w:t>
+      </w:r>
+      <w:proofErr w:type="spellStart"/>
+      <w:r>
+        <w:rPr>
+          <w:rFonts w:ascii="Times New Roman" w:hAnsi="Times New Roman" w:cs="Times New Roman"/>
+          <w:sz w:val="24"/>
+          <w:szCs w:val="24"/>
+        </w:rPr>
+        <w:t>teks</w:t>
+      </w:r>
+      <w:proofErr w:type="spellEnd"/>
+      <w:r>
+        <w:rPr>
+          <w:rFonts w:ascii="Times New Roman" w:hAnsi="Times New Roman" w:cs="Times New Roman"/>
+          <w:sz w:val="24"/>
+          <w:szCs w:val="24"/>
+        </w:rPr>
+        <w:t xml:space="preserve"> </w:t>
+      </w:r>
+      <w:proofErr w:type="spellStart"/>
+      <w:r>
+        <w:rPr>
+          <w:rFonts w:ascii="Times New Roman" w:hAnsi="Times New Roman" w:cs="Times New Roman"/>
+          <w:sz w:val="24"/>
+          <w:szCs w:val="24"/>
+        </w:rPr>
+        <w:t>hasil</w:t>
+      </w:r>
+      <w:proofErr w:type="spellEnd"/>
+      <w:r>
+        <w:rPr>
+          <w:rFonts w:ascii="Times New Roman" w:hAnsi="Times New Roman" w:cs="Times New Roman"/>
+          <w:i/>
+          <w:iCs/>
+          <w:sz w:val="24"/>
+          <w:szCs w:val="24"/>
+        </w:rPr>
+        <w:t xml:space="preserve"> Speech-to-Text, </w:t>
+      </w:r>
+      <w:proofErr w:type="spellStart"/>
+      <w:r>
+        <w:rPr>
+          <w:rFonts w:ascii="Times New Roman" w:hAnsi="Times New Roman" w:cs="Times New Roman"/>
+          <w:sz w:val="24"/>
+          <w:szCs w:val="24"/>
+        </w:rPr>
+        <w:t>kemudian</w:t>
+      </w:r>
+      <w:proofErr w:type="spellEnd"/>
+      <w:r>
+        <w:rPr>
+          <w:rFonts w:ascii="Times New Roman" w:hAnsi="Times New Roman" w:cs="Times New Roman"/>
+          <w:sz w:val="24"/>
+          <w:szCs w:val="24"/>
+        </w:rPr>
+        <w:t xml:space="preserve"> </w:t>
+      </w:r>
+      <w:proofErr w:type="spellStart"/>
+      <w:r>
+        <w:rPr>
+          <w:rFonts w:ascii="Times New Roman" w:hAnsi="Times New Roman" w:cs="Times New Roman"/>
+          <w:sz w:val="24"/>
+          <w:szCs w:val="24"/>
+        </w:rPr>
+        <w:t>menyimpannya</w:t>
+      </w:r>
+      <w:proofErr w:type="spellEnd"/>
+      <w:r>
+        <w:rPr>
+          <w:rFonts w:ascii="Times New Roman" w:hAnsi="Times New Roman" w:cs="Times New Roman"/>
+          <w:sz w:val="24"/>
+          <w:szCs w:val="24"/>
+        </w:rPr>
+        <w:t xml:space="preserve"> </w:t>
+      </w:r>
+      <w:proofErr w:type="spellStart"/>
+      <w:r>
+        <w:rPr>
+          <w:rFonts w:ascii="Times New Roman" w:hAnsi="Times New Roman" w:cs="Times New Roman"/>
+          <w:sz w:val="24"/>
+          <w:szCs w:val="24"/>
+        </w:rPr>
+        <w:t>secara</w:t>
+      </w:r>
+      <w:proofErr w:type="spellEnd"/>
+      <w:r>
+        <w:rPr>
+          <w:rFonts w:ascii="Times New Roman" w:hAnsi="Times New Roman" w:cs="Times New Roman"/>
+          <w:sz w:val="24"/>
+          <w:szCs w:val="24"/>
+        </w:rPr>
+        <w:t xml:space="preserve"> </w:t>
+      </w:r>
+      <w:proofErr w:type="spellStart"/>
+      <w:r>
+        <w:rPr>
+          <w:rFonts w:ascii="Times New Roman" w:hAnsi="Times New Roman" w:cs="Times New Roman"/>
+          <w:sz w:val="24"/>
+          <w:szCs w:val="24"/>
+        </w:rPr>
+        <w:t>otomatis</w:t>
+      </w:r>
+      <w:proofErr w:type="spellEnd"/>
+      <w:r>
+        <w:rPr>
+          <w:rFonts w:ascii="Times New Roman" w:hAnsi="Times New Roman" w:cs="Times New Roman"/>
+          <w:sz w:val="24"/>
+          <w:szCs w:val="24"/>
+        </w:rPr>
+        <w:t xml:space="preserve"> </w:t>
+      </w:r>
+      <w:proofErr w:type="spellStart"/>
+      <w:r>
+        <w:rPr>
+          <w:rFonts w:ascii="Times New Roman" w:hAnsi="Times New Roman" w:cs="Times New Roman"/>
+          <w:sz w:val="24"/>
+          <w:szCs w:val="24"/>
+        </w:rPr>
+        <w:t>ke</w:t>
+      </w:r>
+      <w:proofErr w:type="spellEnd"/>
+      <w:r>
+        <w:rPr>
+          <w:rFonts w:ascii="Times New Roman" w:hAnsi="Times New Roman" w:cs="Times New Roman"/>
+          <w:sz w:val="24"/>
+          <w:szCs w:val="24"/>
+        </w:rPr>
+        <w:t xml:space="preserve"> basis data</w:t>
+      </w:r>
       <w:r>
         <w:rPr>
           <w:rFonts w:ascii="Times New Roman" w:hAnsi="Times New Roman" w:cs="Times New Roman"/>
@@ -14792,7 +14997,6 @@
           <w:szCs w:val="24"/>
           <w:lang w:val="sv-SE"/>
         </w:rPr>
-        <w:lastRenderedPageBreak/>
         <w:t>Fitur utama yang dikembangkan meliputi:</w:t>
       </w:r>
     </w:p>
@@ -14822,7 +15026,7 @@
           <w:lang w:val="sv-SE"/>
           <w14:ligatures w14:val="none"/>
         </w:rPr>
-        <w:t>Pencatatan data barang menggunakan suara (</w:t>
+        <w:t>Pencatatan data barang melalui suara (</w:t>
       </w:r>
       <w:r>
         <w:rPr>
@@ -14846,7 +15050,31 @@
           <w:lang w:val="sv-SE"/>
           <w14:ligatures w14:val="none"/>
         </w:rPr>
-        <w:t xml:space="preserve">). </w:t>
+        <w:t xml:space="preserve">) yang dilanjutkan dengan ekstraksi entitas otomatis menggunakan </w:t>
+      </w:r>
+      <w:r>
+        <w:rPr>
+          <w:rFonts w:ascii="Times New Roman" w:eastAsia="Times New Roman" w:hAnsi="Times New Roman" w:cs="Times New Roman"/>
+          <w:i/>
+          <w:iCs/>
+          <w:kern w:val="0"/>
+          <w:sz w:val="24"/>
+          <w:szCs w:val="24"/>
+          <w:lang w:val="sv-SE"/>
+          <w14:ligatures w14:val="none"/>
+        </w:rPr>
+        <w:t>NLP</w:t>
+      </w:r>
+      <w:r>
+        <w:rPr>
+          <w:rFonts w:ascii="Times New Roman" w:eastAsia="Times New Roman" w:hAnsi="Times New Roman" w:cs="Times New Roman"/>
+          <w:kern w:val="0"/>
+          <w:sz w:val="24"/>
+          <w:szCs w:val="24"/>
+          <w:lang w:val="sv-SE"/>
+          <w14:ligatures w14:val="none"/>
+        </w:rPr>
+        <w:t>.</w:t>
       </w:r>
     </w:p>
     <w:p>
@@ -14858,6 +15086,14 @@
         </w:numPr>
         <w:jc w:val="left"/>
         <w:rPr>
+          <w:rFonts w:ascii="Times New Roman" w:hAnsi="Times New Roman" w:cs="Times New Roman"/>
+          <w:sz w:val="24"/>
+          <w:szCs w:val="24"/>
+          <w:lang w:val="sv-SE"/>
+        </w:rPr>
+      </w:pPr>
+      <w:r>
+        <w:rPr>
           <w:rFonts w:ascii="Times New Roman" w:eastAsia="Times New Roman" w:hAnsi="Times New Roman" w:cs="Times New Roman"/>
           <w:kern w:val="0"/>
           <w:sz w:val="24"/>
@@ -14865,7 +15101,8 @@
           <w:lang w:val="sv-SE"/>
           <w14:ligatures w14:val="none"/>
         </w:rPr>
-      </w:pPr>
+        <w:t>Pencarian data barang berdasarkan nama, lokasi, atau atribut lainnya</w:t>
+      </w:r>
       <w:r>
         <w:rPr>
           <w:rFonts w:ascii="Times New Roman" w:eastAsia="Times New Roman" w:hAnsi="Times New Roman" w:cs="Times New Roman"/>
@@ -14877,7 +15114,7 @@
           <w:lang w:val="sv-SE"/>
           <w14:ligatures w14:val="none"/>
         </w:rPr>
-        <w:t>Generate</w:t>
+        <w:t>.</w:t>
       </w:r>
       <w:r>
         <w:rPr>
@@ -14888,201 +15125,7 @@
           <w:lang w:val="sv-SE"/>
           <w14:ligatures w14:val="none"/>
         </w:rPr>
-        <w:t xml:space="preserve"> dan </w:t>
-      </w:r>
-      <w:r>
-        <w:rPr>
-          <w:rFonts w:ascii="Times New Roman" w:eastAsia="Times New Roman" w:hAnsi="Times New Roman" w:cs="Times New Roman"/>
-          <w:i/>
-          <w:iCs/>
-          <w:kern w:val="0"/>
-          <w:sz w:val="24"/>
-          <w:szCs w:val="24"/>
-          <w:lang w:val="sv-SE"/>
-          <w14:ligatures w14:val="none"/>
-        </w:rPr>
-        <w:t>scan</w:t>
-      </w:r>
-      <w:r>
-        <w:rPr>
-          <w:rFonts w:ascii="Times New Roman" w:eastAsia="Times New Roman" w:hAnsi="Times New Roman" w:cs="Times New Roman"/>
-          <w:kern w:val="0"/>
-          <w:sz w:val="24"/>
-          <w:szCs w:val="24"/>
-          <w:lang w:val="sv-SE"/>
-          <w14:ligatures w14:val="none"/>
-        </w:rPr>
         <w:t xml:space="preserve"> </w:t>
-      </w:r>
-      <w:r>
-        <w:rPr>
-          <w:rFonts w:ascii="Times New Roman" w:eastAsia="Times New Roman" w:hAnsi="Times New Roman" w:cs="Times New Roman"/>
-          <w:i/>
-          <w:iCs/>
-          <w:kern w:val="0"/>
-          <w:sz w:val="24"/>
-          <w:szCs w:val="24"/>
-          <w:lang w:val="sv-SE"/>
-          <w14:ligatures w14:val="none"/>
-        </w:rPr>
-        <w:t>QR Code</w:t>
-      </w:r>
-      <w:r>
-        <w:rPr>
-          <w:rFonts w:ascii="Times New Roman" w:eastAsia="Times New Roman" w:hAnsi="Times New Roman" w:cs="Times New Roman"/>
-          <w:kern w:val="0"/>
-          <w:sz w:val="24"/>
-          <w:szCs w:val="24"/>
-          <w:lang w:val="sv-SE"/>
-          <w14:ligatures w14:val="none"/>
-        </w:rPr>
-        <w:t xml:space="preserve"> pada wadah penyimpanan (seperti dus, kotak, atau brankas) untuk mengetahui isi di dalamnya tanpa perlu membukanya</w:t>
-      </w:r>
-      <w:r>
-        <w:rPr>
-          <w:rFonts w:ascii="Times New Roman" w:eastAsia="Times New Roman" w:hAnsi="Times New Roman" w:cs="Times New Roman"/>
-          <w:kern w:val="0"/>
-          <w:sz w:val="24"/>
-          <w:szCs w:val="24"/>
-          <w:lang w:val="sv-SE"/>
-          <w14:ligatures w14:val="none"/>
-        </w:rPr>
-        <w:t xml:space="preserve">. </w:t>
-      </w:r>
-    </w:p>
-    <w:p>
-      <w:pPr>
-        <w:pStyle w:val="ListParagraph"/>
-        <w:numPr>
-          <w:ilvl w:val="2"/>
-          <w:numId w:val="34"/>
-        </w:numPr>
-        <w:jc w:val="left"/>
-        <w:rPr>
-          <w:rFonts w:ascii="Times New Roman" w:eastAsia="Times New Roman" w:hAnsi="Times New Roman" w:cs="Times New Roman"/>
-          <w:kern w:val="0"/>
-          <w:sz w:val="24"/>
-          <w:szCs w:val="24"/>
-          <w:lang w:val="sv-SE"/>
-          <w14:ligatures w14:val="none"/>
-        </w:rPr>
-      </w:pPr>
-      <w:r>
-        <w:rPr>
-          <w:rFonts w:ascii="Times New Roman" w:eastAsia="Times New Roman" w:hAnsi="Times New Roman" w:cs="Times New Roman"/>
-          <w:kern w:val="0"/>
-          <w:sz w:val="24"/>
-          <w:szCs w:val="24"/>
-          <w:lang w:val="sv-SE"/>
-          <w14:ligatures w14:val="none"/>
-        </w:rPr>
-        <w:t xml:space="preserve">Pengingat masa garansi barang. </w:t>
-      </w:r>
-    </w:p>
-    <w:p>
-      <w:pPr>
-        <w:pStyle w:val="ListParagraph"/>
-        <w:numPr>
-          <w:ilvl w:val="2"/>
-          <w:numId w:val="34"/>
-        </w:numPr>
-        <w:jc w:val="left"/>
-        <w:rPr>
-          <w:rFonts w:ascii="Times New Roman" w:eastAsia="Times New Roman" w:hAnsi="Times New Roman" w:cs="Times New Roman"/>
-          <w:kern w:val="0"/>
-          <w:sz w:val="24"/>
-          <w:szCs w:val="24"/>
-          <w:lang w:val="sv-SE"/>
-          <w14:ligatures w14:val="none"/>
-        </w:rPr>
-      </w:pPr>
-      <w:r>
-        <w:rPr>
-          <w:rFonts w:ascii="Times New Roman" w:eastAsia="Times New Roman" w:hAnsi="Times New Roman" w:cs="Times New Roman"/>
-          <w:kern w:val="0"/>
-          <w:sz w:val="24"/>
-          <w:szCs w:val="24"/>
-          <w:lang w:val="sv-SE"/>
-          <w14:ligatures w14:val="none"/>
-        </w:rPr>
-        <w:t>Pencarian data barang.</w:t>
-      </w:r>
-    </w:p>
-    <w:p>
-      <w:pPr>
-        <w:pStyle w:val="ListParagraph"/>
-        <w:numPr>
-          <w:ilvl w:val="2"/>
-          <w:numId w:val="34"/>
-        </w:numPr>
-        <w:jc w:val="left"/>
-        <w:rPr>
-          <w:rFonts w:ascii="Times New Roman" w:eastAsia="Times New Roman" w:hAnsi="Times New Roman" w:cs="Times New Roman"/>
-          <w:kern w:val="0"/>
-          <w:sz w:val="24"/>
-          <w:szCs w:val="24"/>
-          <w:lang w:val="sv-SE"/>
-          <w14:ligatures w14:val="none"/>
-        </w:rPr>
-      </w:pPr>
-      <w:r>
-        <w:rPr>
-          <w:rFonts w:ascii="Times New Roman" w:eastAsia="Times New Roman" w:hAnsi="Times New Roman" w:cs="Times New Roman"/>
-          <w:kern w:val="0"/>
-          <w:sz w:val="24"/>
-          <w:szCs w:val="24"/>
-          <w:lang w:val="sv-SE"/>
-          <w14:ligatures w14:val="none"/>
-        </w:rPr>
-        <w:t>Pengaturan proteksi akses (</w:t>
-      </w:r>
-      <w:r>
-        <w:rPr>
-          <w:rFonts w:ascii="Times New Roman" w:eastAsia="Times New Roman" w:hAnsi="Times New Roman" w:cs="Times New Roman"/>
-          <w:i/>
-          <w:iCs/>
-          <w:kern w:val="0"/>
-          <w:sz w:val="24"/>
-          <w:szCs w:val="24"/>
-          <w:lang w:val="sv-SE"/>
-          <w14:ligatures w14:val="none"/>
-        </w:rPr>
-        <w:t>login</w:t>
-      </w:r>
-      <w:r>
-        <w:rPr>
-          <w:rFonts w:ascii="Times New Roman" w:eastAsia="Times New Roman" w:hAnsi="Times New Roman" w:cs="Times New Roman"/>
-          <w:kern w:val="0"/>
-          <w:sz w:val="24"/>
-          <w:szCs w:val="24"/>
-          <w:lang w:val="sv-SE"/>
-          <w14:ligatures w14:val="none"/>
-        </w:rPr>
-        <w:t xml:space="preserve"> akun dan/atau </w:t>
-      </w:r>
-      <w:r>
-        <w:rPr>
-          <w:rFonts w:ascii="Times New Roman" w:eastAsia="Times New Roman" w:hAnsi="Times New Roman" w:cs="Times New Roman"/>
-          <w:i/>
-          <w:iCs/>
-          <w:kern w:val="0"/>
-          <w:sz w:val="24"/>
-          <w:szCs w:val="24"/>
-          <w:lang w:val="sv-SE"/>
-          <w14:ligatures w14:val="none"/>
-        </w:rPr>
-        <w:t>password</w:t>
-      </w:r>
-      <w:r>
-        <w:rPr>
-          <w:rFonts w:ascii="Times New Roman" w:eastAsia="Times New Roman" w:hAnsi="Times New Roman" w:cs="Times New Roman"/>
-          <w:kern w:val="0"/>
-          <w:sz w:val="24"/>
-          <w:szCs w:val="24"/>
-          <w:lang w:val="sv-SE"/>
-          <w14:ligatures w14:val="none"/>
-        </w:rPr>
-        <w:t>) pada wadah tertentu sesuai tingkat kerahasiaan atau nilai barang yang disimpan.</w:t>
       </w:r>
     </w:p>
     <w:p>
@@ -15107,7 +15150,122 @@
           <w:szCs w:val="24"/>
           <w:lang w:val="sv-SE"/>
         </w:rPr>
-        <w:t>Aplikasi dikembangkan untuk platform Android.</w:t>
+        <w:t>Fitur pendukung yang dikembangkan meliputi</w:t>
+      </w:r>
+      <w:r>
+        <w:rPr>
+          <w:rFonts w:ascii="Times New Roman" w:hAnsi="Times New Roman" w:cs="Times New Roman"/>
+          <w:sz w:val="24"/>
+          <w:szCs w:val="24"/>
+          <w:lang w:val="sv-SE"/>
+        </w:rPr>
+        <w:t>:</w:t>
+      </w:r>
+    </w:p>
+    <w:p>
+      <w:pPr>
+        <w:pStyle w:val="ListParagraph"/>
+        <w:numPr>
+          <w:ilvl w:val="2"/>
+          <w:numId w:val="35"/>
+        </w:numPr>
+        <w:jc w:val="left"/>
+        <w:rPr>
+          <w:rFonts w:ascii="Times New Roman" w:eastAsia="Times New Roman" w:hAnsi="Times New Roman" w:cs="Times New Roman"/>
+          <w:kern w:val="0"/>
+          <w:sz w:val="24"/>
+          <w:szCs w:val="24"/>
+          <w:lang w:val="sv-SE"/>
+          <w14:ligatures w14:val="none"/>
+        </w:rPr>
+      </w:pPr>
+      <w:r>
+        <w:rPr>
+          <w:rFonts w:ascii="Times New Roman" w:eastAsia="Times New Roman" w:hAnsi="Times New Roman" w:cs="Times New Roman"/>
+          <w:kern w:val="0"/>
+          <w:sz w:val="24"/>
+          <w:szCs w:val="24"/>
+          <w:lang w:val="sv-SE"/>
+          <w14:ligatures w14:val="none"/>
+        </w:rPr>
+        <w:t xml:space="preserve">Generate dan scan </w:t>
+      </w:r>
+      <w:r>
+        <w:rPr>
+          <w:rFonts w:ascii="Times New Roman" w:eastAsia="Times New Roman" w:hAnsi="Times New Roman" w:cs="Times New Roman"/>
+          <w:i/>
+          <w:iCs/>
+          <w:kern w:val="0"/>
+          <w:sz w:val="24"/>
+          <w:szCs w:val="24"/>
+          <w:lang w:val="sv-SE"/>
+          <w14:ligatures w14:val="none"/>
+        </w:rPr>
+        <w:t>QR Code</w:t>
+      </w:r>
+      <w:r>
+        <w:rPr>
+          <w:rFonts w:ascii="Times New Roman" w:eastAsia="Times New Roman" w:hAnsi="Times New Roman" w:cs="Times New Roman"/>
+          <w:kern w:val="0"/>
+          <w:sz w:val="24"/>
+          <w:szCs w:val="24"/>
+          <w:lang w:val="sv-SE"/>
+          <w14:ligatures w14:val="none"/>
+        </w:rPr>
+        <w:t xml:space="preserve"> pada wadah penyimpanan (seperti dus, kotak, atau brankas) untuk mengetahui daftar isi di dalamnya tanpa perlu membukanya secara fisik, dilengkapi opsi proteksi akses (</w:t>
+      </w:r>
+      <w:r>
+        <w:rPr>
+          <w:rFonts w:ascii="Times New Roman" w:eastAsia="Times New Roman" w:hAnsi="Times New Roman" w:cs="Times New Roman"/>
+          <w:i/>
+          <w:iCs/>
+          <w:kern w:val="0"/>
+          <w:sz w:val="24"/>
+          <w:szCs w:val="24"/>
+          <w:lang w:val="sv-SE"/>
+          <w14:ligatures w14:val="none"/>
+        </w:rPr>
+        <w:t>password</w:t>
+      </w:r>
+      <w:r>
+        <w:rPr>
+          <w:rFonts w:ascii="Times New Roman" w:eastAsia="Times New Roman" w:hAnsi="Times New Roman" w:cs="Times New Roman"/>
+          <w:kern w:val="0"/>
+          <w:sz w:val="24"/>
+          <w:szCs w:val="24"/>
+          <w:lang w:val="sv-SE"/>
+          <w14:ligatures w14:val="none"/>
+        </w:rPr>
+        <w:t>) yang dapat diaktifkan sesuai kebutuhan pengguna.</w:t>
+      </w:r>
+    </w:p>
+    <w:p>
+      <w:pPr>
+        <w:pStyle w:val="ListParagraph"/>
+        <w:numPr>
+          <w:ilvl w:val="2"/>
+          <w:numId w:val="35"/>
+        </w:numPr>
+        <w:jc w:val="left"/>
+        <w:rPr>
+          <w:rFonts w:ascii="Times New Roman" w:eastAsia="Times New Roman" w:hAnsi="Times New Roman" w:cs="Times New Roman"/>
+          <w:kern w:val="0"/>
+          <w:sz w:val="24"/>
+          <w:szCs w:val="24"/>
+          <w:lang w:val="sv-SE"/>
+          <w14:ligatures w14:val="none"/>
+        </w:rPr>
+      </w:pPr>
+      <w:r>
+        <w:rPr>
+          <w:rFonts w:ascii="Times New Roman" w:eastAsia="Times New Roman" w:hAnsi="Times New Roman" w:cs="Times New Roman"/>
+          <w:kern w:val="0"/>
+          <w:sz w:val="24"/>
+          <w:szCs w:val="24"/>
+          <w:lang w:val="sv-SE"/>
+          <w14:ligatures w14:val="none"/>
+        </w:rPr>
+        <w:t>Pengingat masa garansi barang berbasis notifikasi.</w:t>
       </w:r>
     </w:p>
     <w:p>
@@ -15132,27 +15290,16 @@
           <w:szCs w:val="24"/>
           <w:lang w:val="sv-SE"/>
         </w:rPr>
-        <w:t>Pengujian dilakukan terbatas pada pengujian fungsionalitas dan kemudahan penggunaan (</w:t>
-      </w:r>
-      <w:r>
-        <w:rPr>
-          <w:rFonts w:ascii="Times New Roman" w:hAnsi="Times New Roman" w:cs="Times New Roman"/>
-          <w:i/>
-          <w:iCs/>
-          <w:sz w:val="24"/>
-          <w:szCs w:val="24"/>
-          <w:lang w:val="sv-SE"/>
-        </w:rPr>
-        <w:t>usability</w:t>
-      </w:r>
-      <w:r>
-        <w:rPr>
-          <w:rFonts w:ascii="Times New Roman" w:hAnsi="Times New Roman" w:cs="Times New Roman"/>
-          <w:sz w:val="24"/>
-          <w:szCs w:val="24"/>
-          <w:lang w:val="sv-SE"/>
-        </w:rPr>
-        <w:t>) aplikasi.</w:t>
+        <w:t>Aplikasi dikembangkan untuk platform Android</w:t>
+      </w:r>
+      <w:r>
+        <w:rPr>
+          <w:rFonts w:ascii="Times New Roman" w:hAnsi="Times New Roman" w:cs="Times New Roman"/>
+          <w:sz w:val="24"/>
+          <w:szCs w:val="24"/>
+          <w:lang w:val="sv-SE"/>
+        </w:rPr>
+        <w:t>.</w:t>
       </w:r>
     </w:p>
     <w:p>
@@ -15177,7 +15324,112 @@
           <w:szCs w:val="24"/>
           <w:lang w:val="sv-SE"/>
         </w:rPr>
-        <w:t>Penelitian ini tidak membahas aspek keamanan data tingkat lanjut, integrasi dengan sistem cloud kompleks, maupun pengembangan untuk platform iOS.</w:t>
+        <w:t xml:space="preserve">Pengujian dilakukan terbatas pada pengujian fungsionalitas dengan </w:t>
+      </w:r>
+      <w:r>
+        <w:rPr>
+          <w:rFonts w:ascii="Times New Roman" w:hAnsi="Times New Roman" w:cs="Times New Roman"/>
+          <w:i/>
+          <w:iCs/>
+          <w:sz w:val="24"/>
+          <w:szCs w:val="24"/>
+          <w:lang w:val="sv-SE"/>
+        </w:rPr>
+        <w:t>black box</w:t>
+      </w:r>
+      <w:r>
+        <w:rPr>
+          <w:rFonts w:ascii="Times New Roman" w:hAnsi="Times New Roman" w:cs="Times New Roman"/>
+          <w:sz w:val="24"/>
+          <w:szCs w:val="24"/>
+          <w:lang w:val="sv-SE"/>
+        </w:rPr>
+        <w:t xml:space="preserve"> testing dan pengujian kemudahan penggunaan (</w:t>
+      </w:r>
+      <w:r>
+        <w:rPr>
+          <w:rFonts w:ascii="Times New Roman" w:hAnsi="Times New Roman" w:cs="Times New Roman"/>
+          <w:i/>
+          <w:iCs/>
+          <w:sz w:val="24"/>
+          <w:szCs w:val="24"/>
+          <w:lang w:val="sv-SE"/>
+        </w:rPr>
+        <w:t>usability</w:t>
+      </w:r>
+      <w:r>
+        <w:rPr>
+          <w:rFonts w:ascii="Times New Roman" w:hAnsi="Times New Roman" w:cs="Times New Roman"/>
+          <w:sz w:val="24"/>
+          <w:szCs w:val="24"/>
+          <w:lang w:val="sv-SE"/>
+        </w:rPr>
+        <w:t xml:space="preserve">) menggunakan kuesioner </w:t>
+      </w:r>
+      <w:r>
+        <w:rPr>
+          <w:rFonts w:ascii="Times New Roman" w:hAnsi="Times New Roman" w:cs="Times New Roman"/>
+          <w:i/>
+          <w:iCs/>
+          <w:sz w:val="24"/>
+          <w:szCs w:val="24"/>
+          <w:lang w:val="sv-SE"/>
+        </w:rPr>
+        <w:t>System Usability Scale (SUS)</w:t>
+      </w:r>
+      <w:r>
+        <w:rPr>
+          <w:rFonts w:ascii="Times New Roman" w:hAnsi="Times New Roman" w:cs="Times New Roman"/>
+          <w:sz w:val="24"/>
+          <w:szCs w:val="24"/>
+          <w:lang w:val="sv-SE"/>
+        </w:rPr>
+        <w:t>.</w:t>
+      </w:r>
+    </w:p>
+    <w:p>
+      <w:pPr>
+        <w:pStyle w:val="ListParagraph"/>
+        <w:numPr>
+          <w:ilvl w:val="0"/>
+          <w:numId w:val="3"/>
+        </w:numPr>
+        <w:ind w:hanging="294"/>
+        <w:rPr>
+          <w:rFonts w:ascii="Times New Roman" w:hAnsi="Times New Roman" w:cs="Times New Roman"/>
+          <w:sz w:val="24"/>
+          <w:szCs w:val="24"/>
+          <w:lang w:val="sv-SE"/>
+        </w:rPr>
+      </w:pPr>
+      <w:r>
+        <w:rPr>
+          <w:rFonts w:ascii="Times New Roman" w:hAnsi="Times New Roman" w:cs="Times New Roman"/>
+          <w:sz w:val="24"/>
+          <w:szCs w:val="24"/>
+          <w:lang w:val="sv-SE"/>
+        </w:rPr>
+        <w:t xml:space="preserve">Penelitian ini tidak membahas aspek keamanan data tingkat lanjut, integrasi dengan sistem cloud kompleks, maupun pengembangan untuk platform </w:t>
+      </w:r>
+      <w:r>
+        <w:rPr>
+          <w:rFonts w:ascii="Times New Roman" w:hAnsi="Times New Roman" w:cs="Times New Roman"/>
+          <w:i/>
+          <w:iCs/>
+          <w:sz w:val="24"/>
+          <w:szCs w:val="24"/>
+          <w:lang w:val="sv-SE"/>
+        </w:rPr>
+        <w:t>iOS</w:t>
+      </w:r>
+      <w:r>
+        <w:rPr>
+          <w:rFonts w:ascii="Times New Roman" w:hAnsi="Times New Roman" w:cs="Times New Roman"/>
+          <w:sz w:val="24"/>
+          <w:szCs w:val="24"/>
+          <w:lang w:val="sv-SE"/>
+        </w:rPr>
+        <w:t>.</w:t>
       </w:r>
     </w:p>
     <w:p>
@@ -15265,7 +15517,7 @@
           <w:szCs w:val="24"/>
           <w:lang w:val="sv-SE"/>
         </w:rPr>
-        <w:t xml:space="preserve">Tujuan penelitian ini adalah untuk mengembangkan aplikasi inventaris pribadi berbasis </w:t>
+        <w:t xml:space="preserve">Tujuan penelitian ini adalah untuk merancang dan membangun aplikasi inventaris pribadi berbasis mobile Android yang menerapkan </w:t>
       </w:r>
       <w:r>
         <w:rPr>
@@ -15276,16 +15528,16 @@
           <w:szCs w:val="24"/>
           <w:lang w:val="sv-SE"/>
         </w:rPr>
-        <w:t>mobile</w:t>
-      </w:r>
-      <w:r>
-        <w:rPr>
-          <w:rFonts w:ascii="Times New Roman" w:hAnsi="Times New Roman" w:cs="Times New Roman"/>
-          <w:sz w:val="24"/>
-          <w:szCs w:val="24"/>
-          <w:lang w:val="sv-SE"/>
-        </w:rPr>
-        <w:t xml:space="preserve"> yang mengintegrasikan teknologi </w:t>
+        <w:t>Natural Language Processing (NLP)</w:t>
+      </w:r>
+      <w:r>
+        <w:rPr>
+          <w:rFonts w:ascii="Times New Roman" w:hAnsi="Times New Roman" w:cs="Times New Roman"/>
+          <w:sz w:val="24"/>
+          <w:szCs w:val="24"/>
+          <w:lang w:val="sv-SE"/>
+        </w:rPr>
+        <w:t xml:space="preserve"> dan </w:t>
       </w:r>
       <w:r>
         <w:rPr>
@@ -15305,27 +15557,16 @@
           <w:szCs w:val="24"/>
           <w:lang w:val="sv-SE"/>
         </w:rPr>
-        <w:t xml:space="preserve"> dan </w:t>
-      </w:r>
-      <w:r>
-        <w:rPr>
-          <w:rFonts w:ascii="Times New Roman" w:hAnsi="Times New Roman" w:cs="Times New Roman"/>
-          <w:i/>
-          <w:iCs/>
-          <w:sz w:val="24"/>
-          <w:szCs w:val="24"/>
-          <w:lang w:val="sv-SE"/>
-        </w:rPr>
-        <w:t>QR Code</w:t>
-      </w:r>
-      <w:r>
-        <w:rPr>
-          <w:rFonts w:ascii="Times New Roman" w:hAnsi="Times New Roman" w:cs="Times New Roman"/>
-          <w:sz w:val="24"/>
-          <w:szCs w:val="24"/>
-          <w:lang w:val="sv-SE"/>
-        </w:rPr>
-        <w:t xml:space="preserve">, khusus ditujukan bagi individu yang sering lupa lokasi barang, sekaligus dilengkapi fitur pengingat masa garansi. </w:t>
+        <w:t xml:space="preserve"> untuk mengotomasi ekstraksi entitas dari ucapan pengguna, sehingga proses pencatatan barang menjadi lebih cepat, akurat, dan nyaman</w:t>
+      </w:r>
+      <w:r>
+        <w:rPr>
+          <w:rFonts w:ascii="Times New Roman" w:hAnsi="Times New Roman" w:cs="Times New Roman"/>
+          <w:sz w:val="24"/>
+          <w:szCs w:val="24"/>
+          <w:lang w:val="sv-SE"/>
+        </w:rPr>
+        <w:t xml:space="preserve">. </w:t>
       </w:r>
     </w:p>
     <w:p>
@@ -15376,7 +15617,7 @@
           <w:szCs w:val="24"/>
           <w:lang w:val="sv-SE"/>
         </w:rPr>
-        <w:t xml:space="preserve">Merancang dan mengembangkan aplikasi inventaris pribadi berbasis Android yang mengintegrasikan teknologi </w:t>
+        <w:t xml:space="preserve">Merancang dan mengembangkan aplikasi inventaris pribadi berbasis Android yang menerapkan </w:t>
       </w:r>
       <w:r>
         <w:rPr>
@@ -15387,7 +15628,7 @@
           <w:szCs w:val="24"/>
           <w:lang w:val="sv-SE"/>
         </w:rPr>
-        <w:t>Speech-to-Text</w:t>
+        <w:t>Natural Language Processing (NLP)</w:t>
       </w:r>
       <w:r>
         <w:rPr>
@@ -15407,16 +15648,25 @@
           <w:szCs w:val="24"/>
           <w:lang w:val="sv-SE"/>
         </w:rPr>
-        <w:t>QR Code</w:t>
-      </w:r>
-      <w:r>
-        <w:rPr>
-          <w:rFonts w:ascii="Times New Roman" w:hAnsi="Times New Roman" w:cs="Times New Roman"/>
-          <w:sz w:val="24"/>
-          <w:szCs w:val="24"/>
-          <w:lang w:val="sv-SE"/>
-        </w:rPr>
-        <w:t xml:space="preserve">. </w:t>
+        <w:t>Speech-to-Text</w:t>
+      </w:r>
+      <w:r>
+        <w:rPr>
+          <w:rFonts w:ascii="Times New Roman" w:hAnsi="Times New Roman" w:cs="Times New Roman"/>
+          <w:sz w:val="24"/>
+          <w:szCs w:val="24"/>
+          <w:lang w:val="sv-SE"/>
+        </w:rPr>
+        <w:t xml:space="preserve"> untuk mengotomasi ekstraksi entitas pada proses input data barang.</w:t>
+      </w:r>
+      <w:r>
+        <w:rPr>
+          <w:rFonts w:ascii="Times New Roman" w:hAnsi="Times New Roman" w:cs="Times New Roman"/>
+          <w:sz w:val="24"/>
+          <w:szCs w:val="24"/>
+          <w:lang w:val="sv-SE"/>
+        </w:rPr>
+        <w:t xml:space="preserve"> </w:t>
       </w:r>
     </w:p>
     <w:p>
@@ -15444,7 +15694,8 @@
           <w:szCs w:val="24"/>
           <w:lang w:val="sv-SE"/>
         </w:rPr>
-        <w:t xml:space="preserve">Mengimplementasikan fitur input data menggunakan </w:t>
+        <w:lastRenderedPageBreak/>
+        <w:t xml:space="preserve">Mengimplementasikan ekstraksi entitas (nama barang dan lokasi penyimpanan) dari ucapan pengguna menggunakan </w:t>
       </w:r>
       <w:r>
         <w:rPr>
@@ -15455,16 +15706,25 @@
           <w:szCs w:val="24"/>
           <w:lang w:val="sv-SE"/>
         </w:rPr>
-        <w:t>Speech-to-Text</w:t>
-      </w:r>
-      <w:r>
-        <w:rPr>
-          <w:rFonts w:ascii="Times New Roman" w:hAnsi="Times New Roman" w:cs="Times New Roman"/>
-          <w:sz w:val="24"/>
-          <w:szCs w:val="24"/>
-          <w:lang w:val="sv-SE"/>
-        </w:rPr>
-        <w:t xml:space="preserve"> agar proses pencatatan barang menjadi lebih cepat dan mudah. </w:t>
+        <w:t>NLP</w:t>
+      </w:r>
+      <w:r>
+        <w:rPr>
+          <w:rFonts w:ascii="Times New Roman" w:hAnsi="Times New Roman" w:cs="Times New Roman"/>
+          <w:sz w:val="24"/>
+          <w:szCs w:val="24"/>
+          <w:lang w:val="sv-SE"/>
+        </w:rPr>
+        <w:t>, sehingga data tersimpan secara otomatis ke basis data tanpa perlu mengisi formulir manual</w:t>
+      </w:r>
+      <w:r>
+        <w:rPr>
+          <w:rFonts w:ascii="Times New Roman" w:hAnsi="Times New Roman" w:cs="Times New Roman"/>
+          <w:sz w:val="24"/>
+          <w:szCs w:val="24"/>
+          <w:lang w:val="sv-SE"/>
+        </w:rPr>
+        <w:t xml:space="preserve">. </w:t>
       </w:r>
     </w:p>
     <w:p>
@@ -15492,7 +15752,7 @@
           <w:szCs w:val="24"/>
           <w:lang w:val="sv-SE"/>
         </w:rPr>
-        <w:t xml:space="preserve">Mengimplementasikan fitur </w:t>
+        <w:t xml:space="preserve">Mengimplementasikan fitur pendukung berupa generate dan scan </w:t>
       </w:r>
       <w:r>
         <w:rPr>
@@ -15503,46 +15763,6 @@
           <w:szCs w:val="24"/>
           <w:lang w:val="sv-SE"/>
         </w:rPr>
-        <w:t>generate</w:t>
-      </w:r>
-      <w:r>
-        <w:rPr>
-          <w:rFonts w:ascii="Times New Roman" w:hAnsi="Times New Roman" w:cs="Times New Roman"/>
-          <w:sz w:val="24"/>
-          <w:szCs w:val="24"/>
-          <w:lang w:val="sv-SE"/>
-        </w:rPr>
-        <w:t xml:space="preserve"> dan </w:t>
-      </w:r>
-      <w:r>
-        <w:rPr>
-          <w:rFonts w:ascii="Times New Roman" w:hAnsi="Times New Roman" w:cs="Times New Roman"/>
-          <w:i/>
-          <w:iCs/>
-          <w:sz w:val="24"/>
-          <w:szCs w:val="24"/>
-          <w:lang w:val="sv-SE"/>
-        </w:rPr>
-        <w:t>scan</w:t>
-      </w:r>
-      <w:r>
-        <w:rPr>
-          <w:rFonts w:ascii="Times New Roman" w:hAnsi="Times New Roman" w:cs="Times New Roman"/>
-          <w:sz w:val="24"/>
-          <w:szCs w:val="24"/>
-          <w:lang w:val="sv-SE"/>
-        </w:rPr>
-        <w:t xml:space="preserve"> </w:t>
-      </w:r>
-      <w:r>
-        <w:rPr>
-          <w:rFonts w:ascii="Times New Roman" w:hAnsi="Times New Roman" w:cs="Times New Roman"/>
-          <w:i/>
-          <w:iCs/>
-          <w:sz w:val="24"/>
-          <w:szCs w:val="24"/>
-          <w:lang w:val="sv-SE"/>
-        </w:rPr>
         <w:t>QR Code</w:t>
       </w:r>
       <w:r>
@@ -15552,7 +15772,7 @@
           <w:szCs w:val="24"/>
           <w:lang w:val="sv-SE"/>
         </w:rPr>
-        <w:t xml:space="preserve"> pada wadah penyimpanan agar pengguna dapat mengetahui isi di dalamnya tanpa harus membukanya secara fisik</w:t>
+        <w:t xml:space="preserve"> pada wadah penyimpanan (dilengkapi opsi proteksi akses password sesuai kebutuhan) serta pengingat masa garansi berbasis notifikasi</w:t>
       </w:r>
       <w:r>
         <w:rPr>
@@ -15589,64 +15809,7 @@
           <w:szCs w:val="24"/>
           <w:lang w:val="sv-SE"/>
         </w:rPr>
-        <w:t>Mengembangkan fitur pengingat masa garansi agar pengguna dapat memeriksa kondisi barang sebelum masa garansi berakhir.</w:t>
-      </w:r>
-    </w:p>
-    <w:p>
-      <w:pPr>
-        <w:pStyle w:val="ListParagraph"/>
-        <w:numPr>
-          <w:ilvl w:val="0"/>
-          <w:numId w:val="9"/>
-        </w:numPr>
-        <w:tabs>
-          <w:tab w:val="left" w:pos="993"/>
-        </w:tabs>
-        <w:ind w:left="1418"/>
-        <w:rPr>
-          <w:rFonts w:ascii="Times New Roman" w:hAnsi="Times New Roman" w:cs="Times New Roman"/>
-          <w:sz w:val="24"/>
-          <w:szCs w:val="24"/>
-          <w:lang w:val="sv-SE"/>
-        </w:rPr>
-      </w:pPr>
-      <w:r>
-        <w:rPr>
-          <w:rFonts w:ascii="Times New Roman" w:hAnsi="Times New Roman" w:cs="Times New Roman"/>
-          <w:sz w:val="24"/>
-          <w:szCs w:val="24"/>
-          <w:lang w:val="sv-SE"/>
-        </w:rPr>
-        <w:t>Melakukan pengujian fungsionalitas dan kemudahan penggunaan aplikasi yang dikembangkan.</w:t>
-      </w:r>
-    </w:p>
-    <w:p>
-      <w:pPr>
-        <w:pStyle w:val="ListParagraph"/>
-        <w:numPr>
-          <w:ilvl w:val="0"/>
-          <w:numId w:val="9"/>
-        </w:numPr>
-        <w:tabs>
-          <w:tab w:val="left" w:pos="993"/>
-        </w:tabs>
-        <w:ind w:left="1418"/>
-        <w:rPr>
-          <w:rFonts w:ascii="Times New Roman" w:hAnsi="Times New Roman" w:cs="Times New Roman"/>
-          <w:sz w:val="24"/>
-          <w:szCs w:val="24"/>
-          <w:lang w:val="sv-SE"/>
-        </w:rPr>
-      </w:pPr>
-      <w:r>
-        <w:rPr>
-          <w:rFonts w:ascii="Times New Roman" w:hAnsi="Times New Roman" w:cs="Times New Roman"/>
-          <w:sz w:val="24"/>
-          <w:szCs w:val="24"/>
-          <w:lang w:val="sv-SE"/>
-        </w:rPr>
-        <w:lastRenderedPageBreak/>
-        <w:t>Mengimplementasikan fitur proteksi akses (</w:t>
+        <w:t>Melakukan pengujian fungsionalitas dengan black box testing dan pengujian kemudahan penggunaan (</w:t>
       </w:r>
       <w:r>
         <w:rPr>
@@ -15657,16 +15820,16 @@
           <w:szCs w:val="24"/>
           <w:lang w:val="sv-SE"/>
         </w:rPr>
-        <w:t>login</w:t>
-      </w:r>
-      <w:r>
-        <w:rPr>
-          <w:rFonts w:ascii="Times New Roman" w:hAnsi="Times New Roman" w:cs="Times New Roman"/>
-          <w:sz w:val="24"/>
-          <w:szCs w:val="24"/>
-          <w:lang w:val="sv-SE"/>
-        </w:rPr>
-        <w:t xml:space="preserve"> akun dan/atau </w:t>
+        <w:t>usability</w:t>
+      </w:r>
+      <w:r>
+        <w:rPr>
+          <w:rFonts w:ascii="Times New Roman" w:hAnsi="Times New Roman" w:cs="Times New Roman"/>
+          <w:sz w:val="24"/>
+          <w:szCs w:val="24"/>
+          <w:lang w:val="sv-SE"/>
+        </w:rPr>
+        <w:t xml:space="preserve">) menggunakan kuesioner </w:t>
       </w:r>
       <w:r>
         <w:rPr>
@@ -15677,16 +15840,16 @@
           <w:szCs w:val="24"/>
           <w:lang w:val="sv-SE"/>
         </w:rPr>
-        <w:t>password</w:t>
-      </w:r>
-      <w:r>
-        <w:rPr>
-          <w:rFonts w:ascii="Times New Roman" w:hAnsi="Times New Roman" w:cs="Times New Roman"/>
-          <w:sz w:val="24"/>
-          <w:szCs w:val="24"/>
-          <w:lang w:val="sv-SE"/>
-        </w:rPr>
-        <w:t>) yang dapat diatur oleh pengguna sesuai kebutuhan keamanan wadah penyimpanan</w:t>
+        <w:t>System Usability Scale (SUS)</w:t>
+      </w:r>
+      <w:r>
+        <w:rPr>
+          <w:rFonts w:ascii="Times New Roman" w:hAnsi="Times New Roman" w:cs="Times New Roman"/>
+          <w:sz w:val="24"/>
+          <w:szCs w:val="24"/>
+          <w:lang w:val="sv-SE"/>
+        </w:rPr>
+        <w:t xml:space="preserve"> pada aplikasi yang dikembangkan</w:t>
       </w:r>
       <w:r>
         <w:rPr>
@@ -15791,7 +15954,7 @@
           <w:szCs w:val="24"/>
           <w:lang w:val="sv-SE"/>
         </w:rPr>
-        <w:t xml:space="preserve">Manfaat teoritis: memberikan kontribusi terhadap pengembangan sistem informasi berbasis </w:t>
+        <w:t xml:space="preserve">Manfaat teoritis: memberikan kontribusi terhadap pengembangan sistem informasi berbasis mobile, khususnya dalam penerapan </w:t>
       </w:r>
       <w:r>
         <w:rPr>
@@ -15802,16 +15965,16 @@
           <w:szCs w:val="24"/>
           <w:lang w:val="sv-SE"/>
         </w:rPr>
-        <w:t>mobile</w:t>
-      </w:r>
-      <w:r>
-        <w:rPr>
-          <w:rFonts w:ascii="Times New Roman" w:hAnsi="Times New Roman" w:cs="Times New Roman"/>
-          <w:sz w:val="24"/>
-          <w:szCs w:val="24"/>
-          <w:lang w:val="sv-SE"/>
-        </w:rPr>
-        <w:t xml:space="preserve">, khususnya dalam penerapan teknologi </w:t>
+        <w:t>Natural Language Processing (NLP)</w:t>
+      </w:r>
+      <w:r>
+        <w:rPr>
+          <w:rFonts w:ascii="Times New Roman" w:hAnsi="Times New Roman" w:cs="Times New Roman"/>
+          <w:sz w:val="24"/>
+          <w:szCs w:val="24"/>
+          <w:lang w:val="sv-SE"/>
+        </w:rPr>
+        <w:t xml:space="preserve"> dan </w:t>
       </w:r>
       <w:r>
         <w:rPr>
@@ -15831,7 +15994,7 @@
           <w:szCs w:val="24"/>
           <w:lang w:val="sv-SE"/>
         </w:rPr>
-        <w:t xml:space="preserve"> dan </w:t>
+        <w:t xml:space="preserve"> untuk otomatisasi ekstraksi entitas pada aplikasi inventaris, serta menambah referensi mengenai rancang bangun aplikasi </w:t>
       </w:r>
       <w:r>
         <w:rPr>
@@ -15842,26 +16005,6 @@
           <w:szCs w:val="24"/>
           <w:lang w:val="sv-SE"/>
         </w:rPr>
-        <w:t>QR Code</w:t>
-      </w:r>
-      <w:r>
-        <w:rPr>
-          <w:rFonts w:ascii="Times New Roman" w:hAnsi="Times New Roman" w:cs="Times New Roman"/>
-          <w:sz w:val="24"/>
-          <w:szCs w:val="24"/>
-          <w:lang w:val="sv-SE"/>
-        </w:rPr>
-        <w:t xml:space="preserve"> pada aplikasi inventaris pribadi, serta menambah referensi mengenai rancang bangun aplikasi </w:t>
-      </w:r>
-      <w:r>
-        <w:rPr>
-          <w:rFonts w:ascii="Times New Roman" w:hAnsi="Times New Roman" w:cs="Times New Roman"/>
-          <w:i/>
-          <w:iCs/>
-          <w:sz w:val="24"/>
-          <w:szCs w:val="24"/>
-          <w:lang w:val="sv-SE"/>
-        </w:rPr>
         <w:t>mobile</w:t>
       </w:r>
       <w:r>
@@ -15871,7 +16014,7 @@
           <w:szCs w:val="24"/>
           <w:lang w:val="sv-SE"/>
         </w:rPr>
-        <w:t xml:space="preserve"> untuk kebutuhan individu</w:t>
+        <w:t xml:space="preserve"> berbasis Android</w:t>
       </w:r>
       <w:r>
         <w:rPr>
@@ -15908,7 +16051,7 @@
           <w:szCs w:val="24"/>
           <w:lang w:val="sv-SE"/>
         </w:rPr>
-        <w:t>Manfaat praktis bagi pengguna: memberikan kemudahan dalam mencatat, mencari, dan mengelola barang pribadi, khususnya bagi individu yang sering lupa lokasi barang, serta membantu mengingat masa garansi barang agar kondisi barang dapat diperiksa sebelum masa garansi berakhir</w:t>
+        <w:t>Manfaat praktis bagi pengguna: memberikan kemudahan dalam mencatat, mencari, dan mengelola barang bagi individu, rumah tangga, dan usaha berskala kecil melalui input suara yang langsung diekstrak menjadi data terstruktur, khususnya bagi mereka yang sering lupa lokasi barang, serta membantu mengingat masa garansi barang</w:t>
       </w:r>
       <w:r>
         <w:rPr>
@@ -16316,6 +16459,7 @@
           <w:color w:val="auto"/>
           <w:lang w:val="sv-SE"/>
         </w:rPr>
+        <w:lastRenderedPageBreak/>
         <w:t>1.6.2. Metode Pengumpulan Data</w:t>
       </w:r>
       <w:bookmarkEnd w:id="22"/>
@@ -16507,7 +16651,6 @@
           <w:szCs w:val="24"/>
           <w:lang w:val="sv-SE"/>
         </w:rPr>
-        <w:lastRenderedPageBreak/>
         <w:tab/>
       </w:r>
       <w:r>
@@ -17073,6 +17216,7 @@
           <w:szCs w:val="24"/>
           <w:lang w:val="sv-SE"/>
         </w:rPr>
+        <w:lastRenderedPageBreak/>
         <w:t>Selain itu, perancan</w:t>
       </w:r>
       <w:r>
@@ -17200,17 +17344,7 @@
           <w:szCs w:val="24"/>
           <w:lang w:val="sv-SE"/>
         </w:rPr>
-        <w:t xml:space="preserve">Bab ini membahas latar belakang penelitian yang mendasari pentingnya pengembangan aplikasi inventaris pribadi berbasis mobile, </w:t>
-      </w:r>
-      <w:r>
-        <w:rPr>
-          <w:rFonts w:ascii="Times New Roman" w:hAnsi="Times New Roman" w:cs="Times New Roman"/>
-          <w:sz w:val="24"/>
-          <w:szCs w:val="24"/>
-          <w:lang w:val="sv-SE"/>
-        </w:rPr>
-        <w:lastRenderedPageBreak/>
-        <w:t>identifikasi masalah, rumusan masalah, ruang lingkup penelitian, tujuan dan manfaat penelitian, metode penelitian yang digunakan, serta sistematika penulisan laporan.</w:t>
+        <w:t>Bab ini membahas latar belakang penelitian yang mendasari pentingnya pengembangan aplikasi inventaris pribadi berbasis mobile, identifikasi masalah, rumusan masalah, ruang lingkup penelitian, tujuan dan manfaat penelitian, metode penelitian yang digunakan, serta sistematika penulisan laporan.</w:t>
       </w:r>
     </w:p>
     <w:p>
@@ -20117,14 +20251,27 @@
         <w:lastRenderedPageBreak/>
         <w:t xml:space="preserve">Tabel 2. </w:t>
       </w:r>
-      <w:fldSimple w:instr=" SEQ Tabel_2. \* ARABIC ">
-        <w:r>
-          <w:rPr>
-            <w:noProof/>
-          </w:rPr>
-          <w:t>1</w:t>
-        </w:r>
-      </w:fldSimple>
+      <w:r>
+        <w:fldChar w:fldCharType="begin"/>
+      </w:r>
+      <w:r>
+        <w:instrText xml:space="preserve"> SEQ Tabel_2. \* ARABIC </w:instrText>
+      </w:r>
+      <w:r>
+        <w:fldChar w:fldCharType="separate"/>
+      </w:r>
+      <w:r>
+        <w:rPr>
+          <w:noProof/>
+        </w:rPr>
+        <w:t>1</w:t>
+      </w:r>
+      <w:r>
+        <w:rPr>
+          <w:noProof/>
+        </w:rPr>
+        <w:fldChar w:fldCharType="end"/>
+      </w:r>
       <w:r>
         <w:t xml:space="preserve"> </w:t>
       </w:r>
@@ -20668,7 +20815,23 @@
                 <w:rFonts w:ascii="Times New Roman" w:hAnsi="Times New Roman" w:cs="Times New Roman"/>
                 <w:sz w:val="24"/>
               </w:rPr>
-              <w:t>(Yuliyanto et al., 2024)</w:t>
+              <w:t>(</w:t>
+            </w:r>
+            <w:proofErr w:type="spellStart"/>
+            <w:r>
+              <w:rPr>
+                <w:rFonts w:ascii="Times New Roman" w:hAnsi="Times New Roman" w:cs="Times New Roman"/>
+                <w:sz w:val="24"/>
+              </w:rPr>
+              <w:t>Yuliyanto</w:t>
+            </w:r>
+            <w:proofErr w:type="spellEnd"/>
+            <w:r>
+              <w:rPr>
+                <w:rFonts w:ascii="Times New Roman" w:hAnsi="Times New Roman" w:cs="Times New Roman"/>
+                <w:sz w:val="24"/>
+              </w:rPr>
+              <w:t xml:space="preserve"> et al., 2024)</w:t>
             </w:r>
             <w:r>
               <w:rPr>
@@ -22403,7 +22566,23 @@
                 <w:rFonts w:ascii="Times New Roman" w:hAnsi="Times New Roman" w:cs="Times New Roman"/>
                 <w:sz w:val="24"/>
               </w:rPr>
-              <w:t>(Rakhma et al., 2022)</w:t>
+              <w:t>(</w:t>
+            </w:r>
+            <w:proofErr w:type="spellStart"/>
+            <w:r>
+              <w:rPr>
+                <w:rFonts w:ascii="Times New Roman" w:hAnsi="Times New Roman" w:cs="Times New Roman"/>
+                <w:sz w:val="24"/>
+              </w:rPr>
+              <w:t>Rakhma</w:t>
+            </w:r>
+            <w:proofErr w:type="spellEnd"/>
+            <w:r>
+              <w:rPr>
+                <w:rFonts w:ascii="Times New Roman" w:hAnsi="Times New Roman" w:cs="Times New Roman"/>
+                <w:sz w:val="24"/>
+              </w:rPr>
+              <w:t xml:space="preserve"> et al., 2022)</w:t>
             </w:r>
             <w:r>
               <w:rPr>
@@ -26806,14 +26985,27 @@
         <w:lastRenderedPageBreak/>
         <w:t xml:space="preserve">Tabel 3. </w:t>
       </w:r>
-      <w:fldSimple w:instr=" SEQ Tabel_3. \* ARABIC ">
-        <w:r>
-          <w:rPr>
-            <w:noProof/>
-          </w:rPr>
-          <w:t>2</w:t>
-        </w:r>
-      </w:fldSimple>
+      <w:r>
+        <w:fldChar w:fldCharType="begin"/>
+      </w:r>
+      <w:r>
+        <w:instrText xml:space="preserve"> SEQ Tabel_3. \* ARABIC </w:instrText>
+      </w:r>
+      <w:r>
+        <w:fldChar w:fldCharType="separate"/>
+      </w:r>
+      <w:r>
+        <w:rPr>
+          <w:noProof/>
+        </w:rPr>
+        <w:t>2</w:t>
+      </w:r>
+      <w:r>
+        <w:rPr>
+          <w:noProof/>
+        </w:rPr>
+        <w:fldChar w:fldCharType="end"/>
+      </w:r>
       <w:r>
         <w:rPr>
           <w:lang w:val="sv-SE"/>
@@ -30591,14 +30783,27 @@
       <w:r>
         <w:t xml:space="preserve">Tabel 3. </w:t>
       </w:r>
-      <w:fldSimple w:instr=" SEQ Tabel_3. \* ARABIC ">
-        <w:r>
-          <w:rPr>
-            <w:noProof/>
-          </w:rPr>
-          <w:t>3</w:t>
-        </w:r>
-      </w:fldSimple>
+      <w:r>
+        <w:fldChar w:fldCharType="begin"/>
+      </w:r>
+      <w:r>
+        <w:instrText xml:space="preserve"> SEQ Tabel_3. \* ARABIC </w:instrText>
+      </w:r>
+      <w:r>
+        <w:fldChar w:fldCharType="separate"/>
+      </w:r>
+      <w:r>
+        <w:rPr>
+          <w:noProof/>
+        </w:rPr>
+        <w:t>3</w:t>
+      </w:r>
+      <w:r>
+        <w:rPr>
+          <w:noProof/>
+        </w:rPr>
+        <w:fldChar w:fldCharType="end"/>
+      </w:r>
       <w:r>
         <w:rPr>
           <w:lang w:val="sv-SE"/>
@@ -36625,38 +36830,18 @@
         </w:rPr>
         <w:t xml:space="preserve">(2), 104. </w:t>
       </w:r>
-      <w:r>
-        <w:fldChar w:fldCharType="begin"/>
-      </w:r>
-      <w:r>
-        <w:rPr>
-          <w:lang w:val="sv-SE"/>
-        </w:rPr>
-        <w:instrText>HYPERLINK "https://doi.org/10.31963/elekterika.v20i2.4631"</w:instrText>
-      </w:r>
-      <w:r>
-        <w:fldChar w:fldCharType="separate"/>
-      </w:r>
-      <w:r>
-        <w:rPr>
-          <w:rStyle w:val="Hyperlink"/>
-          <w:rFonts w:ascii="Times New Roman" w:hAnsi="Times New Roman" w:cs="Times New Roman"/>
-          <w:sz w:val="24"/>
-          <w:szCs w:val="24"/>
-          <w:lang w:val="sv-SE"/>
-        </w:rPr>
-        <w:t>https://doi.org/10.31963/elekterika.v20i2.4631</w:t>
-      </w:r>
-      <w:r>
-        <w:rPr>
-          <w:rStyle w:val="Hyperlink"/>
-          <w:rFonts w:ascii="Times New Roman" w:hAnsi="Times New Roman" w:cs="Times New Roman"/>
-          <w:sz w:val="24"/>
-          <w:szCs w:val="24"/>
-          <w:lang w:val="sv-SE"/>
-        </w:rPr>
-        <w:fldChar w:fldCharType="end"/>
-      </w:r>
+      <w:hyperlink r:id="rId15" w:history="1">
+        <w:r>
+          <w:rPr>
+            <w:rStyle w:val="Hyperlink"/>
+            <w:rFonts w:ascii="Times New Roman" w:hAnsi="Times New Roman" w:cs="Times New Roman"/>
+            <w:sz w:val="24"/>
+            <w:szCs w:val="24"/>
+            <w:lang w:val="sv-SE"/>
+          </w:rPr>
+          <w:t>https://doi.org/10.31963/elekterika.v20i2.4631</w:t>
+        </w:r>
+      </w:hyperlink>
     </w:p>
     <w:p>
       <w:pPr>
@@ -36778,38 +36963,18 @@
         </w:rPr>
         <w:t xml:space="preserve">(3), 373–382. </w:t>
       </w:r>
-      <w:r>
-        <w:fldChar w:fldCharType="begin"/>
-      </w:r>
-      <w:r>
-        <w:rPr>
-          <w:lang w:val="sv-SE"/>
-        </w:rPr>
-        <w:instrText>HYPERLINK "https://doi.org/10.28926/ilkomnika.v6i3.682"</w:instrText>
-      </w:r>
-      <w:r>
-        <w:fldChar w:fldCharType="separate"/>
-      </w:r>
-      <w:r>
-        <w:rPr>
-          <w:rStyle w:val="Hyperlink"/>
-          <w:rFonts w:ascii="Times New Roman" w:hAnsi="Times New Roman" w:cs="Times New Roman"/>
-          <w:sz w:val="24"/>
-          <w:szCs w:val="24"/>
-          <w:lang w:val="sv-SE"/>
-        </w:rPr>
-        <w:t>https://doi.org/10.28926/ilkomnika.v6i3.682</w:t>
-      </w:r>
-      <w:r>
-        <w:rPr>
-          <w:rStyle w:val="Hyperlink"/>
-          <w:rFonts w:ascii="Times New Roman" w:hAnsi="Times New Roman" w:cs="Times New Roman"/>
-          <w:sz w:val="24"/>
-          <w:szCs w:val="24"/>
-          <w:lang w:val="sv-SE"/>
-        </w:rPr>
-        <w:fldChar w:fldCharType="end"/>
-      </w:r>
+      <w:hyperlink r:id="rId16" w:history="1">
+        <w:r>
+          <w:rPr>
+            <w:rStyle w:val="Hyperlink"/>
+            <w:rFonts w:ascii="Times New Roman" w:hAnsi="Times New Roman" w:cs="Times New Roman"/>
+            <w:sz w:val="24"/>
+            <w:szCs w:val="24"/>
+            <w:lang w:val="sv-SE"/>
+          </w:rPr>
+          <w:t>https://doi.org/10.28926/ilkomnika.v6i3.682</w:t>
+        </w:r>
+      </w:hyperlink>
     </w:p>
     <w:p>
       <w:pPr>
@@ -36894,7 +37059,7 @@
         </w:rPr>
         <w:t xml:space="preserve">(1), 95–102. </w:t>
       </w:r>
-      <w:hyperlink r:id="rId15" w:history="1">
+      <w:hyperlink r:id="rId17" w:history="1">
         <w:r>
           <w:rPr>
             <w:rStyle w:val="Hyperlink"/>
@@ -37042,7 +37207,7 @@
         </w:rPr>
         <w:t xml:space="preserve">(2), 101–107. </w:t>
       </w:r>
-      <w:hyperlink r:id="rId16" w:history="1">
+      <w:hyperlink r:id="rId18" w:history="1">
         <w:r>
           <w:rPr>
             <w:rStyle w:val="Hyperlink"/>
@@ -37070,6 +37235,7 @@
           <w:rFonts w:ascii="Times New Roman" w:hAnsi="Times New Roman" w:cs="Times New Roman"/>
           <w:sz w:val="24"/>
           <w:szCs w:val="24"/>
+          <w:lang w:val="sv-SE"/>
         </w:rPr>
         <w:t xml:space="preserve">Mandala, R. C., &amp; Susanto, A. (2023). </w:t>
       </w:r>
@@ -37142,38 +37308,18 @@
         </w:rPr>
         <w:t xml:space="preserve">(1), 47–51. </w:t>
       </w:r>
-      <w:r>
-        <w:fldChar w:fldCharType="begin"/>
-      </w:r>
-      <w:r>
-        <w:rPr>
-          <w:lang w:val="sv-SE"/>
-        </w:rPr>
-        <w:instrText>HYPERLINK "https://doi.org/10.55382/jurnalpustakaai.v3i1.561"</w:instrText>
-      </w:r>
-      <w:r>
-        <w:fldChar w:fldCharType="separate"/>
-      </w:r>
-      <w:r>
-        <w:rPr>
-          <w:rStyle w:val="Hyperlink"/>
-          <w:rFonts w:ascii="Times New Roman" w:hAnsi="Times New Roman" w:cs="Times New Roman"/>
-          <w:sz w:val="24"/>
-          <w:szCs w:val="24"/>
-          <w:lang w:val="sv-SE"/>
-        </w:rPr>
-        <w:t>https://doi.org/10.55382/jurnalpustakaai.v3i1.561</w:t>
-      </w:r>
-      <w:r>
-        <w:rPr>
-          <w:rStyle w:val="Hyperlink"/>
-          <w:rFonts w:ascii="Times New Roman" w:hAnsi="Times New Roman" w:cs="Times New Roman"/>
-          <w:sz w:val="24"/>
-          <w:szCs w:val="24"/>
-          <w:lang w:val="sv-SE"/>
-        </w:rPr>
-        <w:fldChar w:fldCharType="end"/>
-      </w:r>
+      <w:hyperlink r:id="rId19" w:history="1">
+        <w:r>
+          <w:rPr>
+            <w:rStyle w:val="Hyperlink"/>
+            <w:rFonts w:ascii="Times New Roman" w:hAnsi="Times New Roman" w:cs="Times New Roman"/>
+            <w:sz w:val="24"/>
+            <w:szCs w:val="24"/>
+            <w:lang w:val="sv-SE"/>
+          </w:rPr>
+          <w:t>https://doi.org/10.55382/jurnalpustakaai.v3i1.561</w:t>
+        </w:r>
+      </w:hyperlink>
     </w:p>
     <w:p>
       <w:pPr>
@@ -37307,7 +37453,7 @@
         </w:rPr>
         <w:t xml:space="preserve">(2). </w:t>
       </w:r>
-      <w:hyperlink r:id="rId17" w:history="1">
+      <w:hyperlink r:id="rId20" w:history="1">
         <w:r>
           <w:rPr>
             <w:rStyle w:val="Hyperlink"/>
@@ -37390,38 +37536,18 @@
         </w:rPr>
         <w:t xml:space="preserve">(5), 11004–11009. </w:t>
       </w:r>
-      <w:r>
-        <w:fldChar w:fldCharType="begin"/>
-      </w:r>
-      <w:r>
-        <w:rPr>
-          <w:lang w:val="sv-SE"/>
-        </w:rPr>
-        <w:instrText>HYPERLINK "https://doi.org/10.36040/jati.v8i5.11006"</w:instrText>
-      </w:r>
-      <w:r>
-        <w:fldChar w:fldCharType="separate"/>
-      </w:r>
-      <w:r>
-        <w:rPr>
-          <w:rStyle w:val="Hyperlink"/>
-          <w:rFonts w:ascii="Times New Roman" w:hAnsi="Times New Roman" w:cs="Times New Roman"/>
-          <w:sz w:val="24"/>
-          <w:szCs w:val="24"/>
-          <w:lang w:val="sv-SE"/>
-        </w:rPr>
-        <w:t>https://doi.org/10.36040/jati.v8i5.11006</w:t>
-      </w:r>
-      <w:r>
-        <w:rPr>
-          <w:rStyle w:val="Hyperlink"/>
-          <w:rFonts w:ascii="Times New Roman" w:hAnsi="Times New Roman" w:cs="Times New Roman"/>
-          <w:sz w:val="24"/>
-          <w:szCs w:val="24"/>
-          <w:lang w:val="sv-SE"/>
-        </w:rPr>
-        <w:fldChar w:fldCharType="end"/>
-      </w:r>
+      <w:hyperlink r:id="rId21" w:history="1">
+        <w:r>
+          <w:rPr>
+            <w:rStyle w:val="Hyperlink"/>
+            <w:rFonts w:ascii="Times New Roman" w:hAnsi="Times New Roman" w:cs="Times New Roman"/>
+            <w:sz w:val="24"/>
+            <w:szCs w:val="24"/>
+            <w:lang w:val="sv-SE"/>
+          </w:rPr>
+          <w:t>https://doi.org/10.36040/jati.v8i5.11006</w:t>
+        </w:r>
+      </w:hyperlink>
     </w:p>
     <w:p>
       <w:pPr>
@@ -37483,7 +37609,7 @@
         </w:rPr>
         <w:t xml:space="preserve">(2). </w:t>
       </w:r>
-      <w:hyperlink r:id="rId18" w:history="1">
+      <w:hyperlink r:id="rId22" w:history="1">
         <w:r>
           <w:rPr>
             <w:rStyle w:val="Hyperlink"/>
@@ -37536,7 +37662,7 @@
         </w:rPr>
         <w:t xml:space="preserve">. </w:t>
       </w:r>
-      <w:hyperlink r:id="rId19" w:history="1">
+      <w:hyperlink r:id="rId23" w:history="1">
         <w:r>
           <w:rPr>
             <w:rStyle w:val="Hyperlink"/>
@@ -37565,7 +37691,6 @@
           <w:rFonts w:ascii="Times New Roman" w:hAnsi="Times New Roman" w:cs="Times New Roman"/>
           <w:sz w:val="24"/>
           <w:szCs w:val="24"/>
-          <w:lang w:val="sv-SE"/>
         </w:rPr>
         <w:t xml:space="preserve">Tato, F. R., &amp; Ibrahim, I. M. (2025). </w:t>
       </w:r>
@@ -37617,38 +37742,18 @@
         </w:rPr>
         <w:t xml:space="preserve">(2), 233–239. </w:t>
       </w:r>
-      <w:r>
-        <w:fldChar w:fldCharType="begin"/>
-      </w:r>
-      <w:r>
-        <w:rPr>
-          <w:lang w:val="sv-SE"/>
-        </w:rPr>
-        <w:instrText>HYPERLINK "https://doi.org/10.31326/jisa.v7i2.2116"</w:instrText>
-      </w:r>
-      <w:r>
-        <w:fldChar w:fldCharType="separate"/>
-      </w:r>
-      <w:r>
-        <w:rPr>
-          <w:rStyle w:val="Hyperlink"/>
-          <w:rFonts w:ascii="Times New Roman" w:hAnsi="Times New Roman" w:cs="Times New Roman"/>
-          <w:sz w:val="24"/>
-          <w:szCs w:val="24"/>
-          <w:lang w:val="sv-SE"/>
-        </w:rPr>
-        <w:t>https://doi.org/10.31326/jisa.v7i2.2116</w:t>
-      </w:r>
-      <w:r>
-        <w:rPr>
-          <w:rStyle w:val="Hyperlink"/>
-          <w:rFonts w:ascii="Times New Roman" w:hAnsi="Times New Roman" w:cs="Times New Roman"/>
-          <w:sz w:val="24"/>
-          <w:szCs w:val="24"/>
-          <w:lang w:val="sv-SE"/>
-        </w:rPr>
-        <w:fldChar w:fldCharType="end"/>
-      </w:r>
+      <w:hyperlink r:id="rId24" w:history="1">
+        <w:r>
+          <w:rPr>
+            <w:rStyle w:val="Hyperlink"/>
+            <w:rFonts w:ascii="Times New Roman" w:hAnsi="Times New Roman" w:cs="Times New Roman"/>
+            <w:sz w:val="24"/>
+            <w:szCs w:val="24"/>
+            <w:lang w:val="sv-SE"/>
+          </w:rPr>
+          <w:t>https://doi.org/10.31326/jisa.v7i2.2116</w:t>
+        </w:r>
+      </w:hyperlink>
     </w:p>
     <w:p>
       <w:pPr>
@@ -37751,7 +37856,7 @@
         </w:rPr>
         <w:t xml:space="preserve">, 95–102. </w:t>
       </w:r>
-      <w:hyperlink r:id="rId20" w:history="1">
+      <w:hyperlink r:id="rId25" w:history="1">
         <w:r>
           <w:rPr>
             <w:rStyle w:val="Hyperlink"/>
@@ -37863,7 +37968,7 @@
         </w:rPr>
         <w:t xml:space="preserve">(3), 638–649. </w:t>
       </w:r>
-      <w:hyperlink r:id="rId21" w:history="1">
+      <w:hyperlink r:id="rId26" w:history="1">
         <w:r>
           <w:rPr>
             <w:rStyle w:val="Hyperlink"/>
@@ -37899,12 +38004,12 @@
       </w:pPr>
     </w:p>
     <w:sectPr>
-      <w:headerReference w:type="even" r:id="rId22"/>
-      <w:headerReference w:type="default" r:id="rId23"/>
-      <w:footerReference w:type="even" r:id="rId24"/>
-      <w:footerReference w:type="default" r:id="rId25"/>
-      <w:headerReference w:type="first" r:id="rId26"/>
-      <w:footerReference w:type="first" r:id="rId27"/>
+      <w:headerReference w:type="even" r:id="rId27"/>
+      <w:headerReference w:type="default" r:id="rId28"/>
+      <w:footerReference w:type="even" r:id="rId29"/>
+      <w:footerReference w:type="default" r:id="rId30"/>
+      <w:headerReference w:type="first" r:id="rId31"/>
+      <w:footerReference w:type="first" r:id="rId32"/>
       <w:pgSz w:w="11906" w:h="16838" w:code="9"/>
       <w:pgMar w:top="1418" w:right="1418" w:bottom="1418" w:left="1701" w:header="720" w:footer="720" w:gutter="0"/>
       <w:pgNumType w:start="1"/>
@@ -39596,6 +39701,119 @@
     </w:lvl>
   </w:abstractNum>
   <w:abstractNum w:abstractNumId="13" w15:restartNumberingAfterBreak="0">
+    <w:nsid w:val="43AF5C12"/>
+    <w:multiLevelType w:val="multilevel"/>
+    <w:tmpl w:val="B57E4410"/>
+    <w:lvl w:ilvl="0">
+      <w:start w:val="1"/>
+      <w:numFmt w:val="decimal"/>
+      <w:lvlText w:val="%1."/>
+      <w:lvlJc w:val="left"/>
+      <w:pPr>
+        <w:ind w:left="360" w:hanging="360"/>
+      </w:pPr>
+      <w:rPr>
+        <w:rFonts w:hint="default"/>
+      </w:rPr>
+    </w:lvl>
+    <w:lvl w:ilvl="1">
+      <w:start w:val="1"/>
+      <w:numFmt w:val="decimal"/>
+      <w:lvlText w:val="%1.%2."/>
+      <w:lvlJc w:val="left"/>
+      <w:pPr>
+        <w:ind w:left="792" w:hanging="432"/>
+      </w:pPr>
+      <w:rPr>
+        <w:rFonts w:hint="default"/>
+      </w:rPr>
+    </w:lvl>
+    <w:lvl w:ilvl="2">
+      <w:start w:val="1"/>
+      <w:numFmt w:val="lowerLetter"/>
+      <w:lvlText w:val="%3."/>
+      <w:lvlJc w:val="left"/>
+      <w:pPr>
+        <w:ind w:left="1080" w:hanging="360"/>
+      </w:pPr>
+      <w:rPr>
+        <w:rFonts w:hint="default"/>
+      </w:rPr>
+    </w:lvl>
+    <w:lvl w:ilvl="3">
+      <w:start w:val="1"/>
+      <w:numFmt w:val="decimal"/>
+      <w:lvlText w:val="%1.%2.%3.%4."/>
+      <w:lvlJc w:val="left"/>
+      <w:pPr>
+        <w:ind w:left="1728" w:hanging="648"/>
+      </w:pPr>
+      <w:rPr>
+        <w:rFonts w:hint="default"/>
+      </w:rPr>
+    </w:lvl>
+    <w:lvl w:ilvl="4">
+      <w:start w:val="1"/>
+      <w:numFmt w:val="decimal"/>
+      <w:lvlText w:val="%1.%2.%3.%4.%5."/>
+      <w:lvlJc w:val="left"/>
+      <w:pPr>
+        <w:ind w:left="2232" w:hanging="792"/>
+      </w:pPr>
+      <w:rPr>
+        <w:rFonts w:hint="default"/>
+      </w:rPr>
+    </w:lvl>
+    <w:lvl w:ilvl="5">
+      <w:start w:val="1"/>
+      <w:numFmt w:val="decimal"/>
+      <w:lvlText w:val="%1.%2.%3.%4.%5.%6."/>
+      <w:lvlJc w:val="left"/>
+      <w:pPr>
+        <w:ind w:left="2736" w:hanging="936"/>
+      </w:pPr>
+      <w:rPr>
+        <w:rFonts w:hint="default"/>
+      </w:rPr>
+    </w:lvl>
+    <w:lvl w:ilvl="6">
+      <w:start w:val="1"/>
+      <w:numFmt w:val="decimal"/>
+      <w:lvlText w:val="%1.%2.%3.%4.%5.%6.%7."/>
+      <w:lvlJc w:val="left"/>
+      <w:pPr>
+        <w:ind w:left="3240" w:hanging="1080"/>
+      </w:pPr>
+      <w:rPr>
+        <w:rFonts w:hint="default"/>
+      </w:rPr>
+    </w:lvl>
+    <w:lvl w:ilvl="7">
+      <w:start w:val="1"/>
+      <w:numFmt w:val="decimal"/>
+      <w:lvlText w:val="%1.%2.%3.%4.%5.%6.%7.%8."/>
+      <w:lvlJc w:val="left"/>
+      <w:pPr>
+        <w:ind w:left="3744" w:hanging="1224"/>
+      </w:pPr>
+      <w:rPr>
+        <w:rFonts w:hint="default"/>
+      </w:rPr>
+    </w:lvl>
+    <w:lvl w:ilvl="8">
+      <w:start w:val="1"/>
+      <w:numFmt w:val="decimal"/>
+      <w:lvlText w:val="%1.%2.%3.%4.%5.%6.%7.%8.%9."/>
+      <w:lvlJc w:val="left"/>
+      <w:pPr>
+        <w:ind w:left="4320" w:hanging="1440"/>
+      </w:pPr>
+      <w:rPr>
+        <w:rFonts w:hint="default"/>
+      </w:rPr>
+    </w:lvl>
+  </w:abstractNum>
+  <w:abstractNum w:abstractNumId="14" w15:restartNumberingAfterBreak="0">
     <w:nsid w:val="43E15310"/>
     <w:multiLevelType w:val="hybridMultilevel"/>
     <w:tmpl w:val="974CCBE0"/>
@@ -39681,7 +39899,7 @@
       </w:pPr>
     </w:lvl>
   </w:abstractNum>
-  <w:abstractNum w:abstractNumId="14" w15:restartNumberingAfterBreak="0">
+  <w:abstractNum w:abstractNumId="15" w15:restartNumberingAfterBreak="0">
     <w:nsid w:val="44553879"/>
     <w:multiLevelType w:val="hybridMultilevel"/>
     <w:tmpl w:val="82044B6C"/>
@@ -39767,7 +39985,7 @@
       </w:pPr>
     </w:lvl>
   </w:abstractNum>
-  <w:abstractNum w:abstractNumId="15" w15:restartNumberingAfterBreak="0">
+  <w:abstractNum w:abstractNumId="16" w15:restartNumberingAfterBreak="0">
     <w:nsid w:val="4488564C"/>
     <w:multiLevelType w:val="hybridMultilevel"/>
     <w:tmpl w:val="94B455F2"/>
@@ -39860,7 +40078,7 @@
       </w:pPr>
     </w:lvl>
   </w:abstractNum>
-  <w:abstractNum w:abstractNumId="16" w15:restartNumberingAfterBreak="0">
+  <w:abstractNum w:abstractNumId="17" w15:restartNumberingAfterBreak="0">
     <w:nsid w:val="44925056"/>
     <w:multiLevelType w:val="hybridMultilevel"/>
     <w:tmpl w:val="9844F448"/>
@@ -39946,7 +40164,7 @@
       </w:pPr>
     </w:lvl>
   </w:abstractNum>
-  <w:abstractNum w:abstractNumId="17" w15:restartNumberingAfterBreak="0">
+  <w:abstractNum w:abstractNumId="18" w15:restartNumberingAfterBreak="0">
     <w:nsid w:val="4584156B"/>
     <w:multiLevelType w:val="hybridMultilevel"/>
     <w:tmpl w:val="477E3B7E"/>
@@ -40036,7 +40254,7 @@
       </w:pPr>
     </w:lvl>
   </w:abstractNum>
-  <w:abstractNum w:abstractNumId="18" w15:restartNumberingAfterBreak="0">
+  <w:abstractNum w:abstractNumId="19" w15:restartNumberingAfterBreak="0">
     <w:nsid w:val="46600D90"/>
     <w:multiLevelType w:val="hybridMultilevel"/>
     <w:tmpl w:val="0D9092A6"/>
@@ -40122,7 +40340,7 @@
       </w:pPr>
     </w:lvl>
   </w:abstractNum>
-  <w:abstractNum w:abstractNumId="19" w15:restartNumberingAfterBreak="0">
+  <w:abstractNum w:abstractNumId="20" w15:restartNumberingAfterBreak="0">
     <w:nsid w:val="466F418E"/>
     <w:multiLevelType w:val="multilevel"/>
     <w:tmpl w:val="1E04EE84"/>
@@ -40232,7 +40450,7 @@
       </w:rPr>
     </w:lvl>
   </w:abstractNum>
-  <w:abstractNum w:abstractNumId="20" w15:restartNumberingAfterBreak="0">
+  <w:abstractNum w:abstractNumId="21" w15:restartNumberingAfterBreak="0">
     <w:nsid w:val="4C343A98"/>
     <w:multiLevelType w:val="multilevel"/>
     <w:tmpl w:val="0409001F"/>
@@ -40318,7 +40536,7 @@
       </w:pPr>
     </w:lvl>
   </w:abstractNum>
-  <w:abstractNum w:abstractNumId="21" w15:restartNumberingAfterBreak="0">
+  <w:abstractNum w:abstractNumId="22" w15:restartNumberingAfterBreak="0">
     <w:nsid w:val="50731BC1"/>
     <w:multiLevelType w:val="multilevel"/>
     <w:tmpl w:val="138EB074"/>
@@ -40431,10 +40649,10 @@
       </w:rPr>
     </w:lvl>
   </w:abstractNum>
-  <w:abstractNum w:abstractNumId="22" w15:restartNumberingAfterBreak="0">
+  <w:abstractNum w:abstractNumId="23" w15:restartNumberingAfterBreak="0">
     <w:nsid w:val="55AC74E1"/>
     <w:multiLevelType w:val="multilevel"/>
-    <w:tmpl w:val="29061784"/>
+    <w:tmpl w:val="9CEEFA9C"/>
     <w:lvl w:ilvl="0">
       <w:start w:val="1"/>
       <w:numFmt w:val="decimal"/>
@@ -40461,6 +40679,9 @@
       <w:pPr>
         <w:ind w:left="1080" w:hanging="360"/>
       </w:pPr>
+      <w:rPr>
+        <w:rFonts w:hint="default"/>
+      </w:rPr>
     </w:lvl>
     <w:lvl w:ilvl="3">
       <w:start w:val="1"/>
@@ -40517,7 +40738,7 @@
       </w:pPr>
     </w:lvl>
   </w:abstractNum>
-  <w:abstractNum w:abstractNumId="23" w15:restartNumberingAfterBreak="0">
+  <w:abstractNum w:abstractNumId="24" w15:restartNumberingAfterBreak="0">
     <w:nsid w:val="57EF324E"/>
     <w:multiLevelType w:val="hybridMultilevel"/>
     <w:tmpl w:val="14DC886E"/>
@@ -40610,7 +40831,7 @@
       </w:pPr>
     </w:lvl>
   </w:abstractNum>
-  <w:abstractNum w:abstractNumId="24" w15:restartNumberingAfterBreak="0">
+  <w:abstractNum w:abstractNumId="25" w15:restartNumberingAfterBreak="0">
     <w:nsid w:val="63975226"/>
     <w:multiLevelType w:val="multilevel"/>
     <w:tmpl w:val="0409001D"/>
@@ -40696,7 +40917,7 @@
       </w:pPr>
     </w:lvl>
   </w:abstractNum>
-  <w:abstractNum w:abstractNumId="25" w15:restartNumberingAfterBreak="0">
+  <w:abstractNum w:abstractNumId="26" w15:restartNumberingAfterBreak="0">
     <w:nsid w:val="64F00708"/>
     <w:multiLevelType w:val="multilevel"/>
     <w:tmpl w:val="3E2819CA"/>
@@ -40809,7 +41030,7 @@
       </w:rPr>
     </w:lvl>
   </w:abstractNum>
-  <w:abstractNum w:abstractNumId="26" w15:restartNumberingAfterBreak="0">
+  <w:abstractNum w:abstractNumId="27" w15:restartNumberingAfterBreak="0">
     <w:nsid w:val="689311FE"/>
     <w:multiLevelType w:val="multilevel"/>
     <w:tmpl w:val="DC7AB2B2"/>
@@ -40958,7 +41179,7 @@
       </w:rPr>
     </w:lvl>
   </w:abstractNum>
-  <w:abstractNum w:abstractNumId="27" w15:restartNumberingAfterBreak="0">
+  <w:abstractNum w:abstractNumId="28" w15:restartNumberingAfterBreak="0">
     <w:nsid w:val="6B6850BA"/>
     <w:multiLevelType w:val="hybridMultilevel"/>
     <w:tmpl w:val="F23206A8"/>
@@ -41070,7 +41291,7 @@
       </w:rPr>
     </w:lvl>
   </w:abstractNum>
-  <w:abstractNum w:abstractNumId="28" w15:restartNumberingAfterBreak="0">
+  <w:abstractNum w:abstractNumId="29" w15:restartNumberingAfterBreak="0">
     <w:nsid w:val="6BFB45A9"/>
     <w:multiLevelType w:val="hybridMultilevel"/>
     <w:tmpl w:val="2BC8F7BC"/>
@@ -41159,7 +41380,7 @@
       </w:pPr>
     </w:lvl>
   </w:abstractNum>
-  <w:abstractNum w:abstractNumId="29" w15:restartNumberingAfterBreak="0">
+  <w:abstractNum w:abstractNumId="30" w15:restartNumberingAfterBreak="0">
     <w:nsid w:val="6C193A93"/>
     <w:multiLevelType w:val="multilevel"/>
     <w:tmpl w:val="C56C5E0A"/>
@@ -41248,7 +41469,7 @@
       </w:pPr>
     </w:lvl>
   </w:abstractNum>
-  <w:abstractNum w:abstractNumId="30" w15:restartNumberingAfterBreak="0">
+  <w:abstractNum w:abstractNumId="31" w15:restartNumberingAfterBreak="0">
     <w:nsid w:val="6C7813B6"/>
     <w:multiLevelType w:val="hybridMultilevel"/>
     <w:tmpl w:val="C9847034"/>
@@ -41337,7 +41558,7 @@
       </w:pPr>
     </w:lvl>
   </w:abstractNum>
-  <w:abstractNum w:abstractNumId="31" w15:restartNumberingAfterBreak="0">
+  <w:abstractNum w:abstractNumId="32" w15:restartNumberingAfterBreak="0">
     <w:nsid w:val="72AD2F6E"/>
     <w:multiLevelType w:val="hybridMultilevel"/>
     <w:tmpl w:val="00CCFC20"/>
@@ -41427,7 +41648,7 @@
       </w:pPr>
     </w:lvl>
   </w:abstractNum>
-  <w:abstractNum w:abstractNumId="32" w15:restartNumberingAfterBreak="0">
+  <w:abstractNum w:abstractNumId="33" w15:restartNumberingAfterBreak="0">
     <w:nsid w:val="7B3277BF"/>
     <w:multiLevelType w:val="hybridMultilevel"/>
     <w:tmpl w:val="6BB8E598"/>
@@ -41517,7 +41738,7 @@
       </w:pPr>
     </w:lvl>
   </w:abstractNum>
-  <w:abstractNum w:abstractNumId="33" w15:restartNumberingAfterBreak="0">
+  <w:abstractNum w:abstractNumId="34" w15:restartNumberingAfterBreak="0">
     <w:nsid w:val="7F844D2D"/>
     <w:multiLevelType w:val="hybridMultilevel"/>
     <w:tmpl w:val="0A384B8E"/>
@@ -41607,10 +41828,10 @@
     <w:abstractNumId w:val="10"/>
   </w:num>
   <w:num w:numId="2" w16cid:durableId="1245607041">
-    <w:abstractNumId w:val="14"/>
+    <w:abstractNumId w:val="15"/>
   </w:num>
   <w:num w:numId="3" w16cid:durableId="1837919347">
-    <w:abstractNumId w:val="13"/>
+    <w:abstractNumId w:val="14"/>
   </w:num>
   <w:num w:numId="4" w16cid:durableId="1004555483">
     <w:abstractNumId w:val="12"/>
@@ -41619,37 +41840,37 @@
     <w:abstractNumId w:val="5"/>
   </w:num>
   <w:num w:numId="6" w16cid:durableId="29497734">
-    <w:abstractNumId w:val="21"/>
+    <w:abstractNumId w:val="22"/>
   </w:num>
   <w:num w:numId="7" w16cid:durableId="558640002">
-    <w:abstractNumId w:val="18"/>
+    <w:abstractNumId w:val="19"/>
   </w:num>
   <w:num w:numId="8" w16cid:durableId="1465541858">
-    <w:abstractNumId w:val="27"/>
+    <w:abstractNumId w:val="28"/>
   </w:num>
   <w:num w:numId="9" w16cid:durableId="927496676">
-    <w:abstractNumId w:val="33"/>
+    <w:abstractNumId w:val="34"/>
   </w:num>
   <w:num w:numId="10" w16cid:durableId="591856327">
     <w:abstractNumId w:val="2"/>
   </w:num>
   <w:num w:numId="11" w16cid:durableId="1410419121">
-    <w:abstractNumId w:val="16"/>
+    <w:abstractNumId w:val="17"/>
   </w:num>
   <w:num w:numId="12" w16cid:durableId="2135977635">
     <w:abstractNumId w:val="3"/>
   </w:num>
   <w:num w:numId="13" w16cid:durableId="1601330031">
-    <w:abstractNumId w:val="26"/>
+    <w:abstractNumId w:val="27"/>
   </w:num>
   <w:num w:numId="14" w16cid:durableId="1752458605">
     <w:abstractNumId w:val="1"/>
   </w:num>
   <w:num w:numId="15" w16cid:durableId="1341004705">
-    <w:abstractNumId w:val="28"/>
+    <w:abstractNumId w:val="29"/>
   </w:num>
   <w:num w:numId="16" w16cid:durableId="801076350">
-    <w:abstractNumId w:val="23"/>
+    <w:abstractNumId w:val="24"/>
   </w:num>
   <w:num w:numId="17" w16cid:durableId="556279468">
     <w:abstractNumId w:val="11"/>
@@ -41661,49 +41882,52 @@
     <w:abstractNumId w:val="8"/>
   </w:num>
   <w:num w:numId="20" w16cid:durableId="1065879317">
+    <w:abstractNumId w:val="26"/>
+  </w:num>
+  <w:num w:numId="21" w16cid:durableId="807548959">
     <w:abstractNumId w:val="25"/>
   </w:num>
-  <w:num w:numId="21" w16cid:durableId="807548959">
-    <w:abstractNumId w:val="24"/>
-  </w:num>
   <w:num w:numId="22" w16cid:durableId="1232154435">
-    <w:abstractNumId w:val="20"/>
+    <w:abstractNumId w:val="21"/>
   </w:num>
   <w:num w:numId="23" w16cid:durableId="1530527882">
     <w:abstractNumId w:val="7"/>
   </w:num>
   <w:num w:numId="24" w16cid:durableId="1682468593">
-    <w:abstractNumId w:val="29"/>
+    <w:abstractNumId w:val="30"/>
   </w:num>
   <w:num w:numId="25" w16cid:durableId="1532764863">
     <w:abstractNumId w:val="6"/>
   </w:num>
   <w:num w:numId="26" w16cid:durableId="1393044131">
-    <w:abstractNumId w:val="30"/>
+    <w:abstractNumId w:val="31"/>
   </w:num>
   <w:num w:numId="27" w16cid:durableId="1760367702">
-    <w:abstractNumId w:val="17"/>
+    <w:abstractNumId w:val="18"/>
   </w:num>
   <w:num w:numId="28" w16cid:durableId="1614705698">
-    <w:abstractNumId w:val="32"/>
+    <w:abstractNumId w:val="33"/>
   </w:num>
   <w:num w:numId="29" w16cid:durableId="512114928">
-    <w:abstractNumId w:val="31"/>
+    <w:abstractNumId w:val="32"/>
   </w:num>
   <w:num w:numId="30" w16cid:durableId="739060249">
     <w:abstractNumId w:val="0"/>
   </w:num>
   <w:num w:numId="31" w16cid:durableId="1578636277">
-    <w:abstractNumId w:val="15"/>
+    <w:abstractNumId w:val="16"/>
   </w:num>
   <w:num w:numId="32" w16cid:durableId="148862976">
     <w:abstractNumId w:val="9"/>
   </w:num>
   <w:num w:numId="33" w16cid:durableId="911432720">
-    <w:abstractNumId w:val="19"/>
+    <w:abstractNumId w:val="20"/>
   </w:num>
   <w:num w:numId="34" w16cid:durableId="651057444">
-    <w:abstractNumId w:val="22"/>
+    <w:abstractNumId w:val="23"/>
+  </w:num>
+  <w:num w:numId="35" w16cid:durableId="1220940165">
+    <w:abstractNumId w:val="13"/>
   </w:num>
 </w:numbering>
 </file>

</xml_diff>